<commit_message>
docs: shift idea pitch to 26 Oct and lock solo participation
Give participants extra day before selection, add Demo Day format, weighted final criteria, prize fund, and make the Challenge individual-only.

Co-authored-by: Cursor <cursoragent@cursor.com>
</commit_message>
<xml_diff>
--- a/Регламент AI Challenge.docx
+++ b/Регламент AI Challenge.docx
@@ -55,7 +55,7 @@
           <w:color w:val="666666"/>
           <w:sz w:val="22"/>
         </w:rPr>
-        <w:t>Период: 8 октября — 10 ноября 2026. Документ для участников и организаторов. Открытые пункты выделены синим.</w:t>
+        <w:t>Период: 8 октября — 11 ноября 2026. Документ для участников и организаторов. Открытые пункты выделены синим.</w:t>
       </w:r>
     </w:p>
     <w:p>
@@ -139,7 +139,7 @@
           <w:color w:val="1A1A1A"/>
           <w:sz w:val="22"/>
         </w:rPr>
-        <w:t xml:space="preserve">Участвовать можно одному или командой. </w:t>
+        <w:t>Участие только одиночное: один человек — один проект. Если берёте процесс другой команды, его нужно хорошо знать. Согласие владельца процесса нужно до представления идеи. Порядок записи владелец объявит 8 октября.</w:t>
       </w:r>
       <w:r>
         <w:rPr>
@@ -148,7 +148,6 @@
           <w:color w:val="389BFF"/>
           <w:sz w:val="22"/>
         </w:rPr>
-        <w:t xml:space="preserve">Размер команды и порядок регистрации владелец объявит 8 октября. </w:t>
       </w:r>
       <w:r>
         <w:rPr>
@@ -157,7 +156,6 @@
           <w:color w:val="1A1A1A"/>
           <w:sz w:val="22"/>
         </w:rPr>
-        <w:t xml:space="preserve">Если берёте процесс другой команды, его нужно хорошо знать. </w:t>
       </w:r>
       <w:r>
         <w:rPr>
@@ -166,7 +164,6 @@
           <w:color w:val="389BFF"/>
           <w:sz w:val="22"/>
         </w:rPr>
-        <w:t>Согласие владельца процесса нужно до представления идеи.</w:t>
       </w:r>
     </w:p>
     <w:p>
@@ -616,7 +613,9 @@
             </w:tcBorders>
           </w:tcPr>
           <w:p>
-            <w:r/>
+            <w:r>
+              <w:t>Отбор идей 26 октября и оценка на демодне</w:t>
+            </w:r>
             <w:r>
               <w:rPr>
                 <w:rFonts w:ascii="Calibri" w:hAnsi="Calibri" w:eastAsia="Calibri"/>
@@ -624,7 +623,6 @@
                 <w:color w:val="1A1A1A"/>
                 <w:sz w:val="20"/>
               </w:rPr>
-              <w:t>Отбор идей 23 октября и оценка на демодне</w:t>
             </w:r>
           </w:p>
         </w:tc>
@@ -690,7 +688,9 @@
             </w:tcBorders>
           </w:tcPr>
           <w:p>
-            <w:r/>
+            <w:r>
+              <w:t>Помощь на этапе MVP, работу за участника не делают</w:t>
+            </w:r>
             <w:r>
               <w:rPr>
                 <w:rFonts w:ascii="Calibri" w:hAnsi="Calibri" w:eastAsia="Calibri"/>
@@ -698,7 +698,6 @@
                 <w:color w:val="1A1A1A"/>
                 <w:sz w:val="20"/>
               </w:rPr>
-              <w:t>Помощь на этапе MVP, работу за команду не делают</w:t>
             </w:r>
           </w:p>
         </w:tc>
@@ -1110,7 +1109,9 @@
             </w:tcBorders>
           </w:tcPr>
           <w:p>
-            <w:r/>
+            <w:r>
+              <w:t>19–26 октября</w:t>
+            </w:r>
             <w:r>
               <w:rPr>
                 <w:rFonts w:ascii="Calibri" w:hAnsi="Calibri" w:eastAsia="Calibri"/>
@@ -1118,7 +1119,6 @@
                 <w:color w:val="1A1A1A"/>
                 <w:sz w:val="20"/>
               </w:rPr>
-              <w:t>19–23 октября</w:t>
             </w:r>
           </w:p>
         </w:tc>
@@ -1182,7 +1182,9 @@
             </w:tcBorders>
           </w:tcPr>
           <w:p>
-            <w:r/>
+            <w:r>
+              <w:t>26 октября</w:t>
+            </w:r>
             <w:r>
               <w:rPr>
                 <w:rFonts w:ascii="Calibri" w:hAnsi="Calibri" w:eastAsia="Calibri"/>
@@ -1190,7 +1192,6 @@
                 <w:color w:val="1A1A1A"/>
                 <w:sz w:val="20"/>
               </w:rPr>
-              <w:t>23 октября</w:t>
             </w:r>
           </w:p>
         </w:tc>
@@ -1255,7 +1256,9 @@
             </w:tcBorders>
           </w:tcPr>
           <w:p>
-            <w:r/>
+            <w:r>
+              <w:t>27 октября — 11 ноября</w:t>
+            </w:r>
             <w:r>
               <w:rPr>
                 <w:rFonts w:ascii="Calibri" w:hAnsi="Calibri" w:eastAsia="Calibri"/>
@@ -1263,7 +1266,6 @@
                 <w:color w:val="1A1A1A"/>
                 <w:sz w:val="20"/>
               </w:rPr>
-              <w:t>25 октября — 9 ноября</w:t>
             </w:r>
           </w:p>
         </w:tc>
@@ -1327,7 +1329,9 @@
             </w:tcBorders>
           </w:tcPr>
           <w:p>
-            <w:r/>
+            <w:r>
+              <w:t>11 ноября</w:t>
+            </w:r>
             <w:r>
               <w:rPr>
                 <w:rFonts w:ascii="Calibri" w:hAnsi="Calibri" w:eastAsia="Calibri"/>
@@ -1335,7 +1339,6 @@
                 <w:color w:val="1A1A1A"/>
                 <w:sz w:val="20"/>
               </w:rPr>
-              <w:t>10 ноября</w:t>
             </w:r>
           </w:p>
         </w:tc>
@@ -1375,7 +1378,9 @@
             </w:tcBorders>
           </w:tcPr>
           <w:p>
-            <w:r/>
+            <w:r>
+              <w:t>Показ, оценка, призы и выбор победителей</w:t>
+            </w:r>
             <w:r>
               <w:rPr>
                 <w:rFonts w:ascii="Calibri" w:hAnsi="Calibri" w:eastAsia="Calibri"/>
@@ -1383,7 +1388,6 @@
                 <w:color w:val="1A1A1A"/>
                 <w:sz w:val="20"/>
               </w:rPr>
-              <w:t>Показ, оценка, выбор победителей</w:t>
             </w:r>
           </w:p>
         </w:tc>
@@ -1498,7 +1502,7 @@
           <w:color w:val="1A1A1A"/>
           <w:sz w:val="26"/>
         </w:rPr>
-        <w:t>5.3. Идея · 19–23 октября</w:t>
+        <w:t>5.3. Идея · 19–26 октября</w:t>
       </w:r>
     </w:p>
     <w:p>
@@ -1586,7 +1590,7 @@
           <w:color w:val="1A1A1A"/>
           <w:sz w:val="22"/>
         </w:rPr>
-        <w:t>Подходят знакомый процесс, конкретное улучшение и прототип, который реально собрать к 9 ноября. Не подходят идея «внедрить ChatGPT», концепция без сценария и обещание идеального продукта на все исключения.</w:t>
+        <w:t>Подходят знакомый процесс, конкретное улучшение и прототип, который реально собрать к 10 ноября. Не подходят идея «внедрить ChatGPT», концепция без сценария и обещание идеального продукта на все исключения.</w:t>
       </w:r>
     </w:p>
     <w:p>
@@ -1600,7 +1604,7 @@
           <w:color w:val="1A1A1A"/>
           <w:sz w:val="26"/>
         </w:rPr>
-        <w:t>5.4. Представление идей и отбор · 23 октября</w:t>
+        <w:t>5.4. Представление идей и отбор · 26 октября</w:t>
       </w:r>
     </w:p>
     <w:p>
@@ -1614,7 +1618,7 @@
           <w:color w:val="1A1A1A"/>
           <w:sz w:val="22"/>
         </w:rPr>
-        <w:t>Команда или участник коротко показывает замысел и ожидаемый эффект. Жюри оценивает каждую идею по пяти критериям от 0 до 5:</w:t>
+        <w:t>Участник коротко показывает замысел и ожидаемый эффект. Жюри оценивает каждую идею по пяти критериям от 0 до 5:</w:t>
       </w:r>
     </w:p>
     <w:p>
@@ -1703,7 +1707,7 @@
           <w:color w:val="1A1A1A"/>
           <w:sz w:val="22"/>
         </w:rPr>
-        <w:t xml:space="preserve">На этом этапе смотрим на ожидаемый эффект. Потенциал применения даёт преимущество, локальное решение тоже подходит. </w:t>
+        <w:t>На этом этапе смотрим на ожидаемый эффект. Потенциал применения даёт преимущество, локальное решение тоже подходит. Квоту в MVP владелец подтвердит до 26 октября; ориентир — 5–7 проектов.</w:t>
       </w:r>
       <w:r>
         <w:rPr>
@@ -1712,7 +1716,6 @@
           <w:color w:val="389BFF"/>
           <w:sz w:val="22"/>
         </w:rPr>
-        <w:t>Квоту в MVP владелец подтвердит до 23 октября; ориентир — 5–7 проектов.</w:t>
       </w:r>
     </w:p>
     <w:p>
@@ -1726,7 +1729,7 @@
           <w:color w:val="1A1A1A"/>
           <w:sz w:val="26"/>
         </w:rPr>
-        <w:t>5.5. Создание MVP · 25 октября — 9 ноября</w:t>
+        <w:t>5.5. Создание MVP · 27 октября — 10 ноября</w:t>
       </w:r>
     </w:p>
     <w:p>
@@ -1768,7 +1771,7 @@
           <w:color w:val="1A1A1A"/>
           <w:sz w:val="26"/>
         </w:rPr>
-        <w:t>5.6. Демодень · 10 ноября</w:t>
+        <w:t>5.6. Демодень · 11 ноября</w:t>
       </w:r>
     </w:p>
     <w:p>
@@ -1782,7 +1785,7 @@
           <w:color w:val="1A1A1A"/>
           <w:sz w:val="22"/>
         </w:rPr>
-        <w:t>Каждый проект показывает: какой процесс взят, как было, что изменено, живой прототип, эффект, что нужно для внедрения. Если эффект оценочный — так и говорим, не выдаём его за измеренный.</w:t>
+        <w:t>Формат показа простой и одинаковый для всех: Было → Стало → Покажите, как это работает → Какой эффект → Что нужно, чтобы вывести в PROD. Если эффект оценочный — так и говорим, не выдаём его за измеренный. Вывод в PROD после демодня не автоматический: нужно отдельное решение спонсоров.</w:t>
       </w:r>
     </w:p>
     <w:p>
@@ -1796,7 +1799,7 @@
           <w:color w:val="1A1A1A"/>
           <w:sz w:val="22"/>
         </w:rPr>
-        <w:t>На демодне жюри смотрит на фактически показанный эффект, работоспособность MVP, качество новой логики, возможность масштабирования и потенциал внедрения.</w:t>
+        <w:t>На финале жюри оценивает по весам, а не по шкале 0–5 из отбора идей: эффект 30%; насколько реально работает MVP 25%; насколько хорошо перепридуман сам процесс 20%; масштабируемость и возможность довести до PROD 15%; качество и понятность демонстрации 10%. Заложенный призовой фонд — 200 000 ₽: 1 место 100 000 ₽, 2 место 50 000 ₽, 3 место 30 000 ₽. Приз не означает внедрение.</w:t>
       </w:r>
     </w:p>
     <w:p>
@@ -2424,7 +2427,9 @@
             </w:tcBorders>
           </w:tcPr>
           <w:p>
-            <w:r/>
+            <w:r>
+              <w:t>до 26 октября</w:t>
+            </w:r>
             <w:r>
               <w:rPr>
                 <w:rFonts w:ascii="Calibri" w:hAnsi="Calibri" w:eastAsia="Calibri"/>
@@ -2432,7 +2437,6 @@
                 <w:color w:val="1A1A1A"/>
                 <w:sz w:val="20"/>
               </w:rPr>
-              <w:t>до 23 октября</w:t>
             </w:r>
           </w:p>
         </w:tc>
@@ -2568,7 +2572,9 @@
             </w:tcBorders>
           </w:tcPr>
           <w:p>
-            <w:r/>
+            <w:r>
+              <w:t>Отбор 0–5 и веса Demo Day</w:t>
+            </w:r>
             <w:r>
               <w:rPr>
                 <w:rFonts w:ascii="Calibri" w:hAnsi="Calibri" w:eastAsia="Calibri"/>
@@ -2576,7 +2582,6 @@
                 <w:color w:val="1A1A1A"/>
                 <w:sz w:val="20"/>
               </w:rPr>
-              <w:t>Пять критериев 0–5</w:t>
             </w:r>
           </w:p>
         </w:tc>
@@ -2616,7 +2621,9 @@
             </w:tcBorders>
           </w:tcPr>
           <w:p>
-            <w:r/>
+            <w:r>
+              <w:t>26 октября</w:t>
+            </w:r>
             <w:r>
               <w:rPr>
                 <w:rFonts w:ascii="Calibri" w:hAnsi="Calibri" w:eastAsia="Calibri"/>
@@ -2624,7 +2631,6 @@
                 <w:color w:val="1A1A1A"/>
                 <w:sz w:val="20"/>
               </w:rPr>
-              <w:t>23 октября</w:t>
             </w:r>
           </w:p>
         </w:tc>
@@ -2710,7 +2716,9 @@
             </w:tcBorders>
           </w:tcPr>
           <w:p>
-            <w:r/>
+            <w:r>
+              <w:t>27 октября</w:t>
+            </w:r>
             <w:r>
               <w:rPr>
                 <w:rFonts w:ascii="Calibri" w:hAnsi="Calibri" w:eastAsia="Calibri"/>
@@ -2718,7 +2726,6 @@
                 <w:color w:val="1A1A1A"/>
                 <w:sz w:val="20"/>
               </w:rPr>
-              <w:t>25 октября</w:t>
             </w:r>
           </w:p>
         </w:tc>
@@ -2760,7 +2767,9 @@
             </w:tcBorders>
           </w:tcPr>
           <w:p>
-            <w:r/>
+            <w:r>
+              <w:t>Одинаковый показ 11 ноября</w:t>
+            </w:r>
             <w:r>
               <w:rPr>
                 <w:rFonts w:ascii="Calibri" w:hAnsi="Calibri" w:eastAsia="Calibri"/>
@@ -2768,7 +2777,6 @@
                 <w:color w:val="1A1A1A"/>
                 <w:sz w:val="20"/>
               </w:rPr>
-              <w:t>Одинаковый показ 10 ноября</w:t>
             </w:r>
           </w:p>
         </w:tc>
@@ -2808,7 +2816,9 @@
             </w:tcBorders>
           </w:tcPr>
           <w:p>
-            <w:r/>
+            <w:r>
+              <w:t>до 10 ноября</w:t>
+            </w:r>
             <w:r>
               <w:rPr>
                 <w:rFonts w:ascii="Calibri" w:hAnsi="Calibri" w:eastAsia="Calibri"/>
@@ -2816,7 +2826,6 @@
                 <w:color w:val="1A1A1A"/>
                 <w:sz w:val="20"/>
               </w:rPr>
-              <w:t>до 9 ноября</w:t>
             </w:r>
           </w:p>
         </w:tc>
@@ -2867,7 +2876,7 @@
           <w:color w:val="1A1A1A"/>
           <w:sz w:val="22"/>
         </w:rPr>
-        <w:t>размер команды и запись;</w:t>
+        <w:t>порядок записи;</w:t>
       </w:r>
     </w:p>
     <w:p>
@@ -2955,7 +2964,7 @@
           <w:color w:val="666666"/>
           <w:sz w:val="20"/>
         </w:rPr>
-        <w:t>Основание: слайды AI Challenge, календарь 8 октября — 10 ноября, оргкоманда и правило контура Bitrix Dev / Work IT Dev.</w:t>
+        <w:t>Основание: слайды AI Challenge, календарь 8 октября — 11 ноября, оргкоманда и правило контура Bitrix Dev / Work IT Dev.</w:t>
       </w:r>
     </w:p>
     <w:sectPr>

</xml_diff>

<commit_message>
docs: lock the idea application and scoring rules
Put the eight-point idea form, new 0–5 criteria, +2 for cross-functional work, and top-management jury on the employee slides.

Co-authored-by: Cursor <cursoragent@cursor.com>
</commit_message>
<xml_diff>
--- a/Регламент AI Challenge.docx
+++ b/Регламент AI Challenge.docx
@@ -139,7 +139,7 @@
           <w:color w:val="1A1A1A"/>
           <w:sz w:val="22"/>
         </w:rPr>
-        <w:t>Участие только одиночное: один человек — один проект. Если берёте процесс другой команды, его нужно хорошо знать. Согласие владельца процесса нужно до представления идеи. Порядок записи владелец объявит 8 октября.</w:t>
+        <w:t>Участие только одиночное: один человек — один проект. Можно брать свой процесс, кросс-функциональный или процесс другой функции, если хорошо понимаете, как он устроен, и можете предложить конкретное изменение. Порядок записи владелец объявит 8 октября.</w:t>
       </w:r>
       <w:r>
         <w:rPr>
@@ -590,7 +590,9 @@
             </w:tcBorders>
           </w:tcPr>
           <w:p>
-            <w:r/>
+            <w:r>
+              <w:t>Топ-менеджмент. Имена объявит владелец</w:t>
+            </w:r>
             <w:r>
               <w:rPr>
                 <w:rFonts w:ascii="Calibri" w:hAnsi="Calibri" w:eastAsia="Calibri"/>
@@ -598,7 +600,6 @@
                 <w:color w:val="1A1A1A"/>
                 <w:sz w:val="20"/>
               </w:rPr>
-              <w:t>Состав объявит владелец</w:t>
             </w:r>
           </w:p>
         </w:tc>
@@ -664,7 +665,9 @@
             </w:tcBorders>
           </w:tcPr>
           <w:p>
-            <w:r/>
+            <w:r>
+              <w:t>Состав объявит владелец</w:t>
+            </w:r>
             <w:r>
               <w:rPr>
                 <w:rFonts w:ascii="Calibri" w:hAnsi="Calibri" w:eastAsia="Calibri"/>
@@ -672,7 +675,6 @@
                 <w:color w:val="1A1A1A"/>
                 <w:sz w:val="20"/>
               </w:rPr>
-              <w:t>Состав объявит владелец</w:t>
             </w:r>
           </w:p>
         </w:tc>
@@ -1516,7 +1518,7 @@
           <w:color w:val="1A1A1A"/>
           <w:sz w:val="22"/>
         </w:rPr>
-        <w:t>Только участники общего тура. Нужно описать:</w:t>
+        <w:t>Только участники общего тура. Участник выбирает процесс и предлагает, как выстроить его иначе. Можно свой процесс, кросс-функциональный или процесс другой функции. Можно отказаться от процесса или его части, если понятно, как тогда будет решаться задача.</w:t>
       </w:r>
     </w:p>
     <w:p>
@@ -1531,7 +1533,7 @@
           <w:color w:val="1A1A1A"/>
           <w:sz w:val="22"/>
         </w:rPr>
-        <w:t>какой процесс взят и как он работает сейчас;</w:t>
+        <w:t>какой процесс меняем и для кого он существует; как он работает сейчас;</w:t>
       </w:r>
     </w:p>
     <w:p>
@@ -1546,7 +1548,7 @@
           <w:color w:val="1A1A1A"/>
           <w:sz w:val="22"/>
         </w:rPr>
-        <w:t>что предлагается изменить;</w:t>
+        <w:t>что в нём хотим изменить; как предлагается выстроить новый процесс;</w:t>
       </w:r>
     </w:p>
     <w:p>
@@ -1561,7 +1563,7 @@
           <w:color w:val="1A1A1A"/>
           <w:sz w:val="22"/>
         </w:rPr>
-        <w:t>какой эффект ожидается и как его сравнить «до» и «после»;</w:t>
+        <w:t>за счёт чего это можно сделать: Bitrix, агенты, автоматизация, интеграция. Детальной архитектуры не нужно; какой эффект ожидаем;</w:t>
       </w:r>
     </w:p>
     <w:p>
@@ -1576,7 +1578,7 @@
           <w:color w:val="1A1A1A"/>
           <w:sz w:val="22"/>
         </w:rPr>
-        <w:t>какой основной сценарий войдёт в MVP.</w:t>
+        <w:t>как будем измерять результат: было X, должно стать Y; кто автор.</w:t>
       </w:r>
     </w:p>
     <w:p>
@@ -1590,7 +1592,7 @@
           <w:color w:val="1A1A1A"/>
           <w:sz w:val="22"/>
         </w:rPr>
-        <w:t>Подходят знакомый процесс, конкретное улучшение и прототип, который реально собрать к 10 ноября. Не подходят идея «внедрить ChatGPT», концепция без сценария и обещание идеального продукта на все исключения.</w:t>
+        <w:t>До подачи заявки можно обсудить идею с Никишевой Еленой. Задача ментора — помочь подумать и направить, не придумать решение за участника. Не подходят идея «внедрить ChatGPT», концепция без сценария и обещание идеального продукта на все исключения.</w:t>
       </w:r>
     </w:p>
     <w:p>
@@ -1618,7 +1620,7 @@
           <w:color w:val="1A1A1A"/>
           <w:sz w:val="22"/>
         </w:rPr>
-        <w:t>Участник коротко показывает замысел и ожидаемый эффект. Жюри оценивает каждую идею по пяти критериям от 0 до 5:</w:t>
+        <w:t>Участник коротко показывает заявку. Жюри — топ-менеджмент компании. Каждую идею оценивают по пяти критериям от 0 до 5:</w:t>
       </w:r>
     </w:p>
     <w:p>
@@ -1633,7 +1635,7 @@
           <w:color w:val="1A1A1A"/>
           <w:sz w:val="22"/>
         </w:rPr>
-        <w:t>эффект — экономия времени, ресурсов или затрат;</w:t>
+        <w:t>бизнес-эффект;</w:t>
       </w:r>
     </w:p>
     <w:p>
@@ -1648,7 +1650,7 @@
           <w:color w:val="1A1A1A"/>
           <w:sz w:val="22"/>
         </w:rPr>
-        <w:t>удобство — людям проще выполнять работу;</w:t>
+        <w:t>ценность и удобство для пользователей процесса;</w:t>
       </w:r>
     </w:p>
     <w:p>
@@ -1663,7 +1665,7 @@
           <w:color w:val="1A1A1A"/>
           <w:sz w:val="22"/>
         </w:rPr>
-        <w:t>качество — меньше ошибок, надёжнее результат;</w:t>
+        <w:t>качество, снижение ошибок и рисков;</w:t>
       </w:r>
     </w:p>
     <w:p>
@@ -1678,7 +1680,7 @@
           <w:color w:val="1A1A1A"/>
           <w:sz w:val="22"/>
         </w:rPr>
-        <w:t>потенциал применения — можно использовать в похожих задачах;</w:t>
+        <w:t>масштабируемость;</w:t>
       </w:r>
     </w:p>
     <w:p>
@@ -1693,7 +1695,7 @@
           <w:color w:val="1A1A1A"/>
           <w:sz w:val="22"/>
         </w:rPr>
-        <w:t>реализуемость MVP — основной сценарий можно собрать за время челленджа.</w:t>
+        <w:t>глубина изменения процесса и реалистичность идеи.</w:t>
       </w:r>
     </w:p>
     <w:p>
@@ -1707,7 +1709,7 @@
           <w:color w:val="1A1A1A"/>
           <w:sz w:val="22"/>
         </w:rPr>
-        <w:t>На этом этапе смотрим на ожидаемый эффект. Потенциал применения даёт преимущество, локальное решение тоже подходит. Квоту в MVP владелец подтвердит до 26 октября; ориентир — 5–7 проектов.</w:t>
+        <w:t>За кросс-функциональное решение жюри даёт ещё +2 балла. Во второй этап проходят лучшие проекты, которые набрали минимально необходимое число баллов. Сколько проектов пойдёт дальше, зависит от числа заявок и их качества. Пороговый балл владелец объявит до 26 октября.</w:t>
       </w:r>
       <w:r>
         <w:rPr>
@@ -2906,7 +2908,7 @@
           <w:color w:val="1A1A1A"/>
           <w:sz w:val="22"/>
         </w:rPr>
-        <w:t>квота проектов в MVP;</w:t>
+        <w:t>пороговый балл отбора идей;</w:t>
       </w:r>
     </w:p>
     <w:p>
@@ -2921,7 +2923,7 @@
           <w:color w:val="1A1A1A"/>
           <w:sz w:val="22"/>
         </w:rPr>
-        <w:t>состав жюри и менторов;</w:t>
+        <w:t>имена жюри и состав менторов MVP;</w:t>
       </w:r>
     </w:p>
     <w:p>

</xml_diff>

<commit_message>
docs: align regulation scoring text with the idea slide
Use the same 0–5 criterion wording as the presentation and drop the leftover owner-approval rule for another team's process.

Co-authored-by: Cursor <cursoragent@cursor.com>
</commit_message>
<xml_diff>
--- a/Регламент AI Challenge.docx
+++ b/Регламент AI Challenge.docx
@@ -4,7 +4,7 @@
   <w:body>
     <w:p>
       <w:pPr>
-        <w:spacing w:after="80" w:before="0" w:line="276" w:lineRule="auto"/>
+        <w:spacing w:after="40" w:before="0" w:line="276" w:lineRule="auto"/>
       </w:pPr>
       <w:r>
         <w:rPr>
@@ -18,12 +18,12 @@
     </w:p>
     <w:p>
       <w:pPr>
-        <w:spacing w:after="200" w:before="0" w:line="276" w:lineRule="auto"/>
+        <w:spacing w:after="160" w:before="80" w:line="276" w:lineRule="auto"/>
       </w:pPr>
       <w:r>
         <w:rPr>
           <w:rFonts w:ascii="Calibri" w:hAnsi="Calibri" w:eastAsia="Calibri"/>
-          <w:b/>
+          <w:b w:val="0"/>
           <w:color w:val="1A1A1A"/>
           <w:sz w:val="52"/>
         </w:rPr>
@@ -32,7 +32,7 @@
     </w:p>
     <w:p>
       <w:pPr>
-        <w:spacing w:after="120" w:before="0" w:line="276" w:lineRule="auto"/>
+        <w:spacing w:after="160" w:before="0" w:line="276" w:lineRule="auto"/>
       </w:pPr>
       <w:r>
         <w:rPr>
@@ -46,7 +46,7 @@
     </w:p>
     <w:p>
       <w:pPr>
-        <w:spacing w:after="320" w:before="0" w:line="276" w:lineRule="auto"/>
+        <w:spacing w:after="160" w:before="0" w:line="276" w:lineRule="auto"/>
       </w:pPr>
       <w:r>
         <w:rPr>
@@ -55,12 +55,12 @@
           <w:color w:val="666666"/>
           <w:sz w:val="22"/>
         </w:rPr>
-        <w:t>Период: 8 октября — 11 ноября 2026. Документ для участников и организаторов. Открытые пункты выделены синим.</w:t>
+        <w:t>Период: 8 октября — 11 ноября 2026. Документ для участников и организаторов. Открытые пункты помечены синим.</w:t>
       </w:r>
     </w:p>
     <w:p>
       <w:pPr>
-        <w:spacing w:after="160" w:before="160" w:line="276" w:lineRule="auto"/>
+        <w:spacing w:after="120" w:before="320" w:line="276" w:lineRule="auto"/>
       </w:pPr>
       <w:r>
         <w:rPr>
@@ -102,7 +102,7 @@
     </w:p>
     <w:p>
       <w:pPr>
-        <w:spacing w:after="160" w:before="160" w:line="276" w:lineRule="auto"/>
+        <w:spacing w:after="120" w:before="320" w:line="276" w:lineRule="auto"/>
       </w:pPr>
       <w:r>
         <w:rPr>
@@ -130,7 +130,7 @@
     </w:p>
     <w:p>
       <w:pPr>
-        <w:spacing w:after="160" w:line="276" w:lineRule="auto"/>
+        <w:spacing w:after="160" w:before="0" w:line="276" w:lineRule="auto"/>
       </w:pPr>
       <w:r>
         <w:rPr>
@@ -139,7 +139,7 @@
           <w:color w:val="1A1A1A"/>
           <w:sz w:val="22"/>
         </w:rPr>
-        <w:t>Участие только одиночное: один человек — один проект. Можно брать свой процесс, кросс-функциональный или процесс другой функции, если хорошо понимаете, как он устроен, и можете предложить конкретное изменение. Порядок записи владелец объявит 8 октября.</w:t>
+        <w:t xml:space="preserve">Участие только одиночное: один человек — один проект. Можно брать свой процесс, кросс-функциональный или процесс другой функции, если хорошо понимаете, как он устроен, и можете предложить конкретное изменение. </w:t>
       </w:r>
       <w:r>
         <w:rPr>
@@ -148,27 +148,12 @@
           <w:color w:val="389BFF"/>
           <w:sz w:val="22"/>
         </w:rPr>
-      </w:r>
-      <w:r>
-        <w:rPr>
-          <w:rFonts w:ascii="Calibri" w:hAnsi="Calibri" w:eastAsia="Calibri"/>
-          <w:b w:val="0"/>
-          <w:color w:val="1A1A1A"/>
-          <w:sz w:val="22"/>
-        </w:rPr>
-      </w:r>
-      <w:r>
-        <w:rPr>
-          <w:rFonts w:ascii="Calibri" w:hAnsi="Calibri" w:eastAsia="Calibri"/>
-          <w:b w:val="0"/>
-          <w:color w:val="389BFF"/>
-          <w:sz w:val="22"/>
-        </w:rPr>
+        <w:t>Порядок записи владелец объявит 8 октября.</w:t>
       </w:r>
     </w:p>
     <w:p>
       <w:pPr>
-        <w:spacing w:after="160" w:before="160" w:line="276" w:lineRule="auto"/>
+        <w:spacing w:after="120" w:before="320" w:line="276" w:lineRule="auto"/>
       </w:pPr>
       <w:r>
         <w:rPr>
@@ -590,9 +575,7 @@
             </w:tcBorders>
           </w:tcPr>
           <w:p>
-            <w:r>
-              <w:t>Топ-менеджмент. Имена объявит владелец</w:t>
-            </w:r>
+            <w:r/>
             <w:r>
               <w:rPr>
                 <w:rFonts w:ascii="Calibri" w:hAnsi="Calibri" w:eastAsia="Calibri"/>
@@ -600,6 +583,16 @@
                 <w:color w:val="1A1A1A"/>
                 <w:sz w:val="20"/>
               </w:rPr>
+              <w:t xml:space="preserve">Топ-менеджмент компании. </w:t>
+            </w:r>
+            <w:r>
+              <w:rPr>
+                <w:rFonts w:ascii="Calibri" w:hAnsi="Calibri" w:eastAsia="Calibri"/>
+                <w:b w:val="0"/>
+                <w:color w:val="389BFF"/>
+                <w:sz w:val="20"/>
+              </w:rPr>
+              <w:t>Имена объявит владелец</w:t>
             </w:r>
           </w:p>
         </w:tc>
@@ -614,9 +607,7 @@
             </w:tcBorders>
           </w:tcPr>
           <w:p>
-            <w:r>
-              <w:t>Отбор идей 26 октября и оценка на демодне</w:t>
-            </w:r>
+            <w:r/>
             <w:r>
               <w:rPr>
                 <w:rFonts w:ascii="Calibri" w:hAnsi="Calibri" w:eastAsia="Calibri"/>
@@ -624,6 +615,7 @@
                 <w:color w:val="1A1A1A"/>
                 <w:sz w:val="20"/>
               </w:rPr>
+              <w:t>Отбор идей 26 октября и оценка на демодне</w:t>
             </w:r>
           </w:p>
         </w:tc>
@@ -649,7 +641,7 @@
                 <w:color w:val="1A1A1A"/>
                 <w:sz w:val="20"/>
               </w:rPr>
-              <w:t>Менторы</w:t>
+              <w:t>Ментор до заявки</w:t>
             </w:r>
           </w:p>
         </w:tc>
@@ -665,9 +657,7 @@
             </w:tcBorders>
           </w:tcPr>
           <w:p>
-            <w:r>
-              <w:t>Состав объявит владелец</w:t>
-            </w:r>
+            <w:r/>
             <w:r>
               <w:rPr>
                 <w:rFonts w:ascii="Calibri" w:hAnsi="Calibri" w:eastAsia="Calibri"/>
@@ -675,6 +665,7 @@
                 <w:color w:val="1A1A1A"/>
                 <w:sz w:val="20"/>
               </w:rPr>
+              <w:t>Никишева Елена</w:t>
             </w:r>
           </w:p>
         </w:tc>
@@ -690,9 +681,7 @@
             </w:tcBorders>
           </w:tcPr>
           <w:p>
-            <w:r>
-              <w:t>Помощь на этапе MVP, работу за участника не делают</w:t>
-            </w:r>
+            <w:r/>
             <w:r>
               <w:rPr>
                 <w:rFonts w:ascii="Calibri" w:hAnsi="Calibri" w:eastAsia="Calibri"/>
@@ -700,6 +689,78 @@
                 <w:color w:val="1A1A1A"/>
                 <w:sz w:val="20"/>
               </w:rPr>
+              <w:t>Помочь подумать и направить, не придумать решение за участника</w:t>
+            </w:r>
+          </w:p>
+        </w:tc>
+      </w:tr>
+      <w:tr>
+        <w:tc>
+          <w:tcPr>
+            <w:tcW w:type="dxa" w:w="3249"/>
+            <w:tcBorders>
+              <w:top w:val="single" w:sz="4" w:color="D0D7DE"/>
+              <w:left w:val="single" w:sz="4" w:color="D0D7DE"/>
+              <w:bottom w:val="single" w:sz="4" w:color="D0D7DE"/>
+              <w:right w:val="single" w:sz="4" w:color="D0D7DE"/>
+            </w:tcBorders>
+          </w:tcPr>
+          <w:p>
+            <w:r/>
+            <w:r>
+              <w:rPr>
+                <w:rFonts w:ascii="Calibri" w:hAnsi="Calibri" w:eastAsia="Calibri"/>
+                <w:b w:val="0"/>
+                <w:color w:val="1A1A1A"/>
+                <w:sz w:val="20"/>
+              </w:rPr>
+              <w:t>Менторы MVP</w:t>
+            </w:r>
+          </w:p>
+        </w:tc>
+        <w:tc>
+          <w:tcPr>
+            <w:tcW w:type="dxa" w:w="3249"/>
+            <w:tcBorders>
+              <w:top w:val="single" w:sz="4" w:color="D0D7DE"/>
+              <w:left w:val="single" w:sz="4" w:color="D0D7DE"/>
+              <w:bottom w:val="single" w:sz="4" w:color="D0D7DE"/>
+              <w:right w:val="single" w:sz="4" w:color="D0D7DE"/>
+            </w:tcBorders>
+          </w:tcPr>
+          <w:p>
+            <w:r/>
+            <w:r>
+              <w:rPr>
+                <w:rFonts w:ascii="Calibri" w:hAnsi="Calibri" w:eastAsia="Calibri"/>
+                <w:b w:val="0"/>
+                <w:color w:val="389BFF"/>
+                <w:sz w:val="20"/>
+              </w:rPr>
+              <w:t>Состав объявит владелец</w:t>
+            </w:r>
+          </w:p>
+        </w:tc>
+        <w:tc>
+          <w:tcPr>
+            <w:tcW w:type="dxa" w:w="3249"/>
+            <w:tcBorders>
+              <w:top w:val="single" w:sz="4" w:color="D0D7DE"/>
+              <w:left w:val="single" w:sz="4" w:color="D0D7DE"/>
+              <w:bottom w:val="single" w:sz="4" w:color="D0D7DE"/>
+              <w:right w:val="single" w:sz="4" w:color="D0D7DE"/>
+            </w:tcBorders>
+          </w:tcPr>
+          <w:p>
+            <w:r/>
+            <w:r>
+              <w:rPr>
+                <w:rFonts w:ascii="Calibri" w:hAnsi="Calibri" w:eastAsia="Calibri"/>
+                <w:b w:val="0"/>
+                <w:color w:val="1A1A1A"/>
+                <w:sz w:val="20"/>
+              </w:rPr>
+              <w:t>Помощь на этапе MVP, работу за участника не делают</w:t>
             </w:r>
           </w:p>
         </w:tc>
@@ -707,12 +768,12 @@
     </w:tbl>
     <w:p>
       <w:pPr>
-        <w:spacing w:after="120"/>
+        <w:spacing w:after="80"/>
       </w:pPr>
     </w:p>
     <w:p>
       <w:pPr>
-        <w:spacing w:after="160" w:before="160" w:line="276" w:lineRule="auto"/>
+        <w:spacing w:after="120" w:before="320" w:line="276" w:lineRule="auto"/>
       </w:pPr>
       <w:r>
         <w:rPr>
@@ -1111,9 +1172,7 @@
             </w:tcBorders>
           </w:tcPr>
           <w:p>
-            <w:r>
-              <w:t>19–26 октября</w:t>
-            </w:r>
+            <w:r/>
             <w:r>
               <w:rPr>
                 <w:rFonts w:ascii="Calibri" w:hAnsi="Calibri" w:eastAsia="Calibri"/>
@@ -1121,6 +1180,7 @@
                 <w:color w:val="1A1A1A"/>
                 <w:sz w:val="20"/>
               </w:rPr>
+              <w:t>19–26 октября</w:t>
             </w:r>
           </w:p>
         </w:tc>
@@ -1184,9 +1244,7 @@
             </w:tcBorders>
           </w:tcPr>
           <w:p>
-            <w:r>
-              <w:t>26 октября</w:t>
-            </w:r>
+            <w:r/>
             <w:r>
               <w:rPr>
                 <w:rFonts w:ascii="Calibri" w:hAnsi="Calibri" w:eastAsia="Calibri"/>
@@ -1194,6 +1252,7 @@
                 <w:color w:val="1A1A1A"/>
                 <w:sz w:val="20"/>
               </w:rPr>
+              <w:t>26 октября</w:t>
             </w:r>
           </w:p>
         </w:tc>
@@ -1258,9 +1317,7 @@
             </w:tcBorders>
           </w:tcPr>
           <w:p>
-            <w:r>
-              <w:t>27 октября — 11 ноября</w:t>
-            </w:r>
+            <w:r/>
             <w:r>
               <w:rPr>
                 <w:rFonts w:ascii="Calibri" w:hAnsi="Calibri" w:eastAsia="Calibri"/>
@@ -1268,6 +1325,7 @@
                 <w:color w:val="1A1A1A"/>
                 <w:sz w:val="20"/>
               </w:rPr>
+              <w:t>27 октября — 10 ноября</w:t>
             </w:r>
           </w:p>
         </w:tc>
@@ -1331,9 +1389,7 @@
             </w:tcBorders>
           </w:tcPr>
           <w:p>
-            <w:r>
-              <w:t>11 ноября</w:t>
-            </w:r>
+            <w:r/>
             <w:r>
               <w:rPr>
                 <w:rFonts w:ascii="Calibri" w:hAnsi="Calibri" w:eastAsia="Calibri"/>
@@ -1341,6 +1397,7 @@
                 <w:color w:val="1A1A1A"/>
                 <w:sz w:val="20"/>
               </w:rPr>
+              <w:t>11 ноября</w:t>
             </w:r>
           </w:p>
         </w:tc>
@@ -1380,9 +1437,7 @@
             </w:tcBorders>
           </w:tcPr>
           <w:p>
-            <w:r>
-              <w:t>Показ, оценка, призы и выбор победителей</w:t>
-            </w:r>
+            <w:r/>
             <w:r>
               <w:rPr>
                 <w:rFonts w:ascii="Calibri" w:hAnsi="Calibri" w:eastAsia="Calibri"/>
@@ -1390,6 +1445,7 @@
                 <w:color w:val="1A1A1A"/>
                 <w:sz w:val="20"/>
               </w:rPr>
+              <w:t>Показ, оценка, призы и выбор победителей</w:t>
             </w:r>
           </w:p>
         </w:tc>
@@ -1397,12 +1453,12 @@
     </w:tbl>
     <w:p>
       <w:pPr>
-        <w:spacing w:after="120"/>
+        <w:spacing w:after="80"/>
       </w:pPr>
     </w:p>
     <w:p>
       <w:pPr>
-        <w:spacing w:after="160" w:line="276" w:lineRule="auto"/>
+        <w:spacing w:after="160" w:before="0" w:line="276" w:lineRule="auto"/>
       </w:pPr>
       <w:r>
         <w:rPr>
@@ -1425,7 +1481,7 @@
     </w:p>
     <w:p>
       <w:pPr>
-        <w:spacing w:after="160" w:before="160" w:line="276" w:lineRule="auto"/>
+        <w:spacing w:after="120" w:before="320" w:line="276" w:lineRule="auto"/>
       </w:pPr>
       <w:r>
         <w:rPr>
@@ -1439,7 +1495,7 @@
     </w:p>
     <w:p>
       <w:pPr>
-        <w:spacing w:after="120" w:before="0" w:line="276" w:lineRule="auto"/>
+        <w:spacing w:after="80" w:before="240" w:line="276" w:lineRule="auto"/>
       </w:pPr>
       <w:r>
         <w:rPr>
@@ -1467,7 +1523,7 @@
     </w:p>
     <w:p>
       <w:pPr>
-        <w:spacing w:after="120" w:before="0" w:line="276" w:lineRule="auto"/>
+        <w:spacing w:after="80" w:before="240" w:line="276" w:lineRule="auto"/>
       </w:pPr>
       <w:r>
         <w:rPr>
@@ -1495,7 +1551,7 @@
     </w:p>
     <w:p>
       <w:pPr>
-        <w:spacing w:after="120" w:before="0" w:line="276" w:lineRule="auto"/>
+        <w:spacing w:after="80" w:before="240" w:line="276" w:lineRule="auto"/>
       </w:pPr>
       <w:r>
         <w:rPr>
@@ -1518,67 +1574,7 @@
           <w:color w:val="1A1A1A"/>
           <w:sz w:val="22"/>
         </w:rPr>
-        <w:t>Только участники общего тура. Участник выбирает процесс и предлагает, как выстроить его иначе. Можно свой процесс, кросс-функциональный или процесс другой функции. Можно отказаться от процесса или его части, если понятно, как тогда будет решаться задача.</w:t>
-      </w:r>
-    </w:p>
-    <w:p>
-      <w:pPr>
-        <w:pStyle w:val="ListBullet"/>
-        <w:spacing w:after="60"/>
-      </w:pPr>
-      <w:r>
-        <w:rPr>
-          <w:rFonts w:ascii="Calibri" w:hAnsi="Calibri" w:eastAsia="Calibri"/>
-          <w:b w:val="0"/>
-          <w:color w:val="1A1A1A"/>
-          <w:sz w:val="22"/>
-        </w:rPr>
-        <w:t>какой процесс меняем и для кого он существует; как он работает сейчас;</w:t>
-      </w:r>
-    </w:p>
-    <w:p>
-      <w:pPr>
-        <w:pStyle w:val="ListBullet"/>
-        <w:spacing w:after="60"/>
-      </w:pPr>
-      <w:r>
-        <w:rPr>
-          <w:rFonts w:ascii="Calibri" w:hAnsi="Calibri" w:eastAsia="Calibri"/>
-          <w:b w:val="0"/>
-          <w:color w:val="1A1A1A"/>
-          <w:sz w:val="22"/>
-        </w:rPr>
-        <w:t>что в нём хотим изменить; как предлагается выстроить новый процесс;</w:t>
-      </w:r>
-    </w:p>
-    <w:p>
-      <w:pPr>
-        <w:pStyle w:val="ListBullet"/>
-        <w:spacing w:after="60"/>
-      </w:pPr>
-      <w:r>
-        <w:rPr>
-          <w:rFonts w:ascii="Calibri" w:hAnsi="Calibri" w:eastAsia="Calibri"/>
-          <w:b w:val="0"/>
-          <w:color w:val="1A1A1A"/>
-          <w:sz w:val="22"/>
-        </w:rPr>
-        <w:t>за счёт чего это можно сделать: Bitrix, агенты, автоматизация, интеграция. Детальной архитектуры не нужно; какой эффект ожидаем;</w:t>
-      </w:r>
-    </w:p>
-    <w:p>
-      <w:pPr>
-        <w:pStyle w:val="ListBullet"/>
-        <w:spacing w:after="60"/>
-      </w:pPr>
-      <w:r>
-        <w:rPr>
-          <w:rFonts w:ascii="Calibri" w:hAnsi="Calibri" w:eastAsia="Calibri"/>
-          <w:b w:val="0"/>
-          <w:color w:val="1A1A1A"/>
-          <w:sz w:val="22"/>
-        </w:rPr>
-        <w:t>как будем измерять результат: было X, должно стать Y; кто автор.</w:t>
+        <w:t>Только участники общего тура. Участник выбирает процесс и предлагает, как выстроить его иначе. Можно свой процесс, кросс-функциональный или процесс другой функции. Можно предложить отказаться от процесса или его части, если понятно, как тогда будет решаться задача.</w:t>
       </w:r>
     </w:p>
     <w:p>
@@ -1592,12 +1588,160 @@
           <w:color w:val="1A1A1A"/>
           <w:sz w:val="22"/>
         </w:rPr>
-        <w:t>До подачи заявки можно обсудить идею с Никишевой Еленой. Задача ментора — помочь подумать и направить, не придумать решение за участника. Не подходят идея «внедрить ChatGPT», концепция без сценария и обещание идеального продукта на все исключения.</w:t>
+        <w:t>В заявке нужно коротко описать:</w:t>
       </w:r>
     </w:p>
     <w:p>
       <w:pPr>
-        <w:spacing w:after="120" w:before="0" w:line="276" w:lineRule="auto"/>
+        <w:pStyle w:val="ListBullet"/>
+        <w:spacing w:after="60" w:line="276" w:lineRule="auto"/>
+      </w:pPr>
+      <w:r>
+        <w:rPr>
+          <w:rFonts w:ascii="Calibri" w:hAnsi="Calibri" w:eastAsia="Calibri"/>
+          <w:b w:val="0"/>
+          <w:color w:val="1A1A1A"/>
+          <w:sz w:val="22"/>
+        </w:rPr>
+        <w:t>какой процесс меняем и для кого он существует;</w:t>
+      </w:r>
+    </w:p>
+    <w:p>
+      <w:pPr>
+        <w:pStyle w:val="ListBullet"/>
+        <w:spacing w:after="60" w:line="276" w:lineRule="auto"/>
+      </w:pPr>
+      <w:r>
+        <w:rPr>
+          <w:rFonts w:ascii="Calibri" w:hAnsi="Calibri" w:eastAsia="Calibri"/>
+          <w:b w:val="0"/>
+          <w:color w:val="1A1A1A"/>
+          <w:sz w:val="22"/>
+        </w:rPr>
+        <w:t>как он работает сейчас;</w:t>
+      </w:r>
+    </w:p>
+    <w:p>
+      <w:pPr>
+        <w:pStyle w:val="ListBullet"/>
+        <w:spacing w:after="60" w:line="276" w:lineRule="auto"/>
+      </w:pPr>
+      <w:r>
+        <w:rPr>
+          <w:rFonts w:ascii="Calibri" w:hAnsi="Calibri" w:eastAsia="Calibri"/>
+          <w:b w:val="0"/>
+          <w:color w:val="1A1A1A"/>
+          <w:sz w:val="22"/>
+        </w:rPr>
+        <w:t>что в нём хотим изменить;</w:t>
+      </w:r>
+    </w:p>
+    <w:p>
+      <w:pPr>
+        <w:pStyle w:val="ListBullet"/>
+        <w:spacing w:after="60" w:line="276" w:lineRule="auto"/>
+      </w:pPr>
+      <w:r>
+        <w:rPr>
+          <w:rFonts w:ascii="Calibri" w:hAnsi="Calibri" w:eastAsia="Calibri"/>
+          <w:b w:val="0"/>
+          <w:color w:val="1A1A1A"/>
+          <w:sz w:val="22"/>
+        </w:rPr>
+        <w:t>как предлагается выстроить новый процесс;</w:t>
+      </w:r>
+    </w:p>
+    <w:p>
+      <w:pPr>
+        <w:pStyle w:val="ListBullet"/>
+        <w:spacing w:after="60" w:line="276" w:lineRule="auto"/>
+      </w:pPr>
+      <w:r>
+        <w:rPr>
+          <w:rFonts w:ascii="Calibri" w:hAnsi="Calibri" w:eastAsia="Calibri"/>
+          <w:b w:val="0"/>
+          <w:color w:val="1A1A1A"/>
+          <w:sz w:val="22"/>
+        </w:rPr>
+        <w:t>за счёт чего это потенциально можно сделать: Bitrix, агенты, автоматизация, интеграция. Детальной технической архитектуры на этом этапе не нужно;</w:t>
+      </w:r>
+    </w:p>
+    <w:p>
+      <w:pPr>
+        <w:pStyle w:val="ListBullet"/>
+        <w:spacing w:after="60" w:line="276" w:lineRule="auto"/>
+      </w:pPr>
+      <w:r>
+        <w:rPr>
+          <w:rFonts w:ascii="Calibri" w:hAnsi="Calibri" w:eastAsia="Calibri"/>
+          <w:b w:val="0"/>
+          <w:color w:val="1A1A1A"/>
+          <w:sz w:val="22"/>
+        </w:rPr>
+        <w:t>какой эффект ожидаем: время, деньги, качество, ошибки, удобство, масштабируемость;</w:t>
+      </w:r>
+    </w:p>
+    <w:p>
+      <w:pPr>
+        <w:pStyle w:val="ListBullet"/>
+        <w:spacing w:after="60" w:line="276" w:lineRule="auto"/>
+      </w:pPr>
+      <w:r>
+        <w:rPr>
+          <w:rFonts w:ascii="Calibri" w:hAnsi="Calibri" w:eastAsia="Calibri"/>
+          <w:b w:val="0"/>
+          <w:color w:val="1A1A1A"/>
+          <w:sz w:val="22"/>
+        </w:rPr>
+        <w:t>как будем измерять результат: было X, должно стать Y;</w:t>
+      </w:r>
+    </w:p>
+    <w:p>
+      <w:pPr>
+        <w:pStyle w:val="ListBullet"/>
+        <w:spacing w:after="60" w:line="276" w:lineRule="auto"/>
+      </w:pPr>
+      <w:r>
+        <w:rPr>
+          <w:rFonts w:ascii="Calibri" w:hAnsi="Calibri" w:eastAsia="Calibri"/>
+          <w:b w:val="0"/>
+          <w:color w:val="1A1A1A"/>
+          <w:sz w:val="22"/>
+        </w:rPr>
+        <w:t>кто автор.</w:t>
+      </w:r>
+    </w:p>
+    <w:p>
+      <w:pPr>
+        <w:spacing w:after="160" w:before="0" w:line="276" w:lineRule="auto"/>
+      </w:pPr>
+      <w:r>
+        <w:rPr>
+          <w:rFonts w:ascii="Calibri" w:hAnsi="Calibri" w:eastAsia="Calibri"/>
+          <w:b w:val="0"/>
+          <w:color w:val="1A1A1A"/>
+          <w:sz w:val="22"/>
+        </w:rPr>
+        <w:t>До подачи заявки можно обсудить идею с Никишевой Еленой. Задача ментора — помочь подумать и направить, не придумать решение за участника.</w:t>
+      </w:r>
+    </w:p>
+    <w:p>
+      <w:pPr>
+        <w:spacing w:after="160" w:before="0" w:line="276" w:lineRule="auto"/>
+      </w:pPr>
+      <w:r>
+        <w:rPr>
+          <w:rFonts w:ascii="Calibri" w:hAnsi="Calibri" w:eastAsia="Calibri"/>
+          <w:b w:val="0"/>
+          <w:color w:val="1A1A1A"/>
+          <w:sz w:val="22"/>
+        </w:rPr>
+        <w:t>Не подходят идея «внедрить ChatGPT», концепция без сценария и обещание идеального продукта на все исключения.</w:t>
+      </w:r>
+    </w:p>
+    <w:p>
+      <w:pPr>
+        <w:spacing w:after="80" w:before="240" w:line="276" w:lineRule="auto"/>
       </w:pPr>
       <w:r>
         <w:rPr>
@@ -1626,7 +1770,7 @@
     <w:p>
       <w:pPr>
         <w:pStyle w:val="ListBullet"/>
-        <w:spacing w:after="60"/>
+        <w:spacing w:after="60" w:line="276" w:lineRule="auto"/>
       </w:pPr>
       <w:r>
         <w:rPr>
@@ -1635,13 +1779,13 @@
           <w:color w:val="1A1A1A"/>
           <w:sz w:val="22"/>
         </w:rPr>
-        <w:t>бизнес-эффект;</w:t>
+        <w:t>бизнес-эффект — время, деньги, результат для компании;</w:t>
       </w:r>
     </w:p>
     <w:p>
       <w:pPr>
         <w:pStyle w:val="ListBullet"/>
-        <w:spacing w:after="60"/>
+        <w:spacing w:after="60" w:line="276" w:lineRule="auto"/>
       </w:pPr>
       <w:r>
         <w:rPr>
@@ -1650,13 +1794,13 @@
           <w:color w:val="1A1A1A"/>
           <w:sz w:val="22"/>
         </w:rPr>
-        <w:t>ценность и удобство для пользователей процесса;</w:t>
+        <w:t>ценность — удобство для пользователей процесса;</w:t>
       </w:r>
     </w:p>
     <w:p>
       <w:pPr>
         <w:pStyle w:val="ListBullet"/>
-        <w:spacing w:after="60"/>
+        <w:spacing w:after="60" w:line="276" w:lineRule="auto"/>
       </w:pPr>
       <w:r>
         <w:rPr>
@@ -1665,13 +1809,13 @@
           <w:color w:val="1A1A1A"/>
           <w:sz w:val="22"/>
         </w:rPr>
-        <w:t>качество, снижение ошибок и рисков;</w:t>
+        <w:t>качество — меньше ошибок и рисков;</w:t>
       </w:r>
     </w:p>
     <w:p>
       <w:pPr>
         <w:pStyle w:val="ListBullet"/>
-        <w:spacing w:after="60"/>
+        <w:spacing w:after="60" w:line="276" w:lineRule="auto"/>
       </w:pPr>
       <w:r>
         <w:rPr>
@@ -1680,13 +1824,13 @@
           <w:color w:val="1A1A1A"/>
           <w:sz w:val="22"/>
         </w:rPr>
-        <w:t>масштабируемость;</w:t>
+        <w:t>масштаб — можно применять шире, чем в одном участке;</w:t>
       </w:r>
     </w:p>
     <w:p>
       <w:pPr>
         <w:pStyle w:val="ListBullet"/>
-        <w:spacing w:after="60"/>
+        <w:spacing w:after="60" w:line="276" w:lineRule="auto"/>
       </w:pPr>
       <w:r>
         <w:rPr>
@@ -1695,12 +1839,12 @@
           <w:color w:val="1A1A1A"/>
           <w:sz w:val="22"/>
         </w:rPr>
-        <w:t>глубина изменения процесса и реалистичность идеи.</w:t>
+        <w:t>глубина и реализм — насколько сильно меняется процесс и насколько идея реалистична.</w:t>
       </w:r>
     </w:p>
     <w:p>
       <w:pPr>
-        <w:spacing w:after="160" w:line="276" w:lineRule="auto"/>
+        <w:spacing w:after="160" w:before="0" w:line="276" w:lineRule="auto"/>
       </w:pPr>
       <w:r>
         <w:rPr>
@@ -1709,7 +1853,7 @@
           <w:color w:val="1A1A1A"/>
           <w:sz w:val="22"/>
         </w:rPr>
-        <w:t>За кросс-функциональное решение жюри даёт ещё +2 балла. Во второй этап проходят лучшие проекты, которые набрали минимально необходимое число баллов. Сколько проектов пойдёт дальше, зависит от числа заявок и их качества. Пороговый балл владелец объявит до 26 октября.</w:t>
+        <w:t xml:space="preserve">За кросс-функциональное решение жюри даёт ещё +2 балла. Во второй этап проходят лучшие проекты, которые набрали минимально необходимое число баллов. Сколько проектов пойдёт дальше, зависит от числа заявок и их качества. </w:t>
       </w:r>
       <w:r>
         <w:rPr>
@@ -1718,11 +1862,12 @@
           <w:color w:val="389BFF"/>
           <w:sz w:val="22"/>
         </w:rPr>
+        <w:t>Пороговый балл владелец объявит до 26 октября.</w:t>
       </w:r>
     </w:p>
     <w:p>
       <w:pPr>
-        <w:spacing w:after="120" w:before="0" w:line="276" w:lineRule="auto"/>
+        <w:spacing w:after="80" w:before="240" w:line="276" w:lineRule="auto"/>
       </w:pPr>
       <w:r>
         <w:rPr>
@@ -1764,7 +1909,7 @@
     </w:p>
     <w:p>
       <w:pPr>
-        <w:spacing w:after="120" w:before="0" w:line="276" w:lineRule="auto"/>
+        <w:spacing w:after="80" w:before="240" w:line="276" w:lineRule="auto"/>
       </w:pPr>
       <w:r>
         <w:rPr>
@@ -1787,7 +1932,82 @@
           <w:color w:val="1A1A1A"/>
           <w:sz w:val="22"/>
         </w:rPr>
-        <w:t>Формат показа простой и одинаковый для всех: Было → Стало → Покажите, как это работает → Какой эффект → Что нужно, чтобы вывести в PROD. Если эффект оценочный — так и говорим, не выдаём его за измеренный. Вывод в PROD после демодня не автоматический: нужно отдельное решение спонсоров.</w:t>
+        <w:t>Формат показа простой и одинаковый для всех:</w:t>
+      </w:r>
+    </w:p>
+    <w:p>
+      <w:pPr>
+        <w:pStyle w:val="ListBullet"/>
+        <w:spacing w:after="60" w:line="276" w:lineRule="auto"/>
+      </w:pPr>
+      <w:r>
+        <w:rPr>
+          <w:rFonts w:ascii="Calibri" w:hAnsi="Calibri" w:eastAsia="Calibri"/>
+          <w:b w:val="0"/>
+          <w:color w:val="1A1A1A"/>
+          <w:sz w:val="22"/>
+        </w:rPr>
+        <w:t>Было;</w:t>
+      </w:r>
+    </w:p>
+    <w:p>
+      <w:pPr>
+        <w:pStyle w:val="ListBullet"/>
+        <w:spacing w:after="60" w:line="276" w:lineRule="auto"/>
+      </w:pPr>
+      <w:r>
+        <w:rPr>
+          <w:rFonts w:ascii="Calibri" w:hAnsi="Calibri" w:eastAsia="Calibri"/>
+          <w:b w:val="0"/>
+          <w:color w:val="1A1A1A"/>
+          <w:sz w:val="22"/>
+        </w:rPr>
+        <w:t>Стало;</w:t>
+      </w:r>
+    </w:p>
+    <w:p>
+      <w:pPr>
+        <w:pStyle w:val="ListBullet"/>
+        <w:spacing w:after="60" w:line="276" w:lineRule="auto"/>
+      </w:pPr>
+      <w:r>
+        <w:rPr>
+          <w:rFonts w:ascii="Calibri" w:hAnsi="Calibri" w:eastAsia="Calibri"/>
+          <w:b w:val="0"/>
+          <w:color w:val="1A1A1A"/>
+          <w:sz w:val="22"/>
+        </w:rPr>
+        <w:t>Покажите, как это работает;</w:t>
+      </w:r>
+    </w:p>
+    <w:p>
+      <w:pPr>
+        <w:pStyle w:val="ListBullet"/>
+        <w:spacing w:after="60" w:line="276" w:lineRule="auto"/>
+      </w:pPr>
+      <w:r>
+        <w:rPr>
+          <w:rFonts w:ascii="Calibri" w:hAnsi="Calibri" w:eastAsia="Calibri"/>
+          <w:b w:val="0"/>
+          <w:color w:val="1A1A1A"/>
+          <w:sz w:val="22"/>
+        </w:rPr>
+        <w:t>Какой эффект;</w:t>
+      </w:r>
+    </w:p>
+    <w:p>
+      <w:pPr>
+        <w:pStyle w:val="ListBullet"/>
+        <w:spacing w:after="60" w:line="276" w:lineRule="auto"/>
+      </w:pPr>
+      <w:r>
+        <w:rPr>
+          <w:rFonts w:ascii="Calibri" w:hAnsi="Calibri" w:eastAsia="Calibri"/>
+          <w:b w:val="0"/>
+          <w:color w:val="1A1A1A"/>
+          <w:sz w:val="22"/>
+        </w:rPr>
+        <w:t>Что нужно, чтобы вывести в PROD.</w:t>
       </w:r>
     </w:p>
     <w:p>
@@ -1801,12 +2021,188 @@
           <w:color w:val="1A1A1A"/>
           <w:sz w:val="22"/>
         </w:rPr>
-        <w:t>На финале жюри оценивает по весам, а не по шкале 0–5 из отбора идей: эффект 30%; насколько реально работает MVP 25%; насколько хорошо перепридуман сам процесс 20%; масштабируемость и возможность довести до PROD 15%; качество и понятность демонстрации 10%. Заложенный призовой фонд — 200 000 ₽: 1 место 100 000 ₽, 2 место 50 000 ₽, 3 место 30 000 ₽. Приз не означает внедрение.</w:t>
+        <w:t>Если эффект оценочный — так и говорим, не выдаём его за измеренный. Вывод в PROD после демодня не автоматический: нужно отдельное решение спонсоров.</w:t>
       </w:r>
     </w:p>
     <w:p>
       <w:pPr>
-        <w:spacing w:after="160" w:before="160" w:line="276" w:lineRule="auto"/>
+        <w:spacing w:after="160" w:before="0" w:line="276" w:lineRule="auto"/>
+      </w:pPr>
+      <w:r>
+        <w:rPr>
+          <w:rFonts w:ascii="Calibri" w:hAnsi="Calibri" w:eastAsia="Calibri"/>
+          <w:b w:val="0"/>
+          <w:color w:val="1A1A1A"/>
+          <w:sz w:val="22"/>
+        </w:rPr>
+        <w:t>На финале жюри оценивает по весам, а не по шкале 0–5 из отбора идей:</w:t>
+      </w:r>
+    </w:p>
+    <w:p>
+      <w:pPr>
+        <w:pStyle w:val="ListBullet"/>
+        <w:spacing w:after="60" w:line="276" w:lineRule="auto"/>
+      </w:pPr>
+      <w:r>
+        <w:rPr>
+          <w:rFonts w:ascii="Calibri" w:hAnsi="Calibri" w:eastAsia="Calibri"/>
+          <w:b w:val="0"/>
+          <w:color w:val="1A1A1A"/>
+          <w:sz w:val="22"/>
+        </w:rPr>
+        <w:t>эффект — 30%;</w:t>
+      </w:r>
+    </w:p>
+    <w:p>
+      <w:pPr>
+        <w:pStyle w:val="ListBullet"/>
+        <w:spacing w:after="60" w:line="276" w:lineRule="auto"/>
+      </w:pPr>
+      <w:r>
+        <w:rPr>
+          <w:rFonts w:ascii="Calibri" w:hAnsi="Calibri" w:eastAsia="Calibri"/>
+          <w:b w:val="0"/>
+          <w:color w:val="1A1A1A"/>
+          <w:sz w:val="22"/>
+        </w:rPr>
+        <w:t>насколько реально работает MVP — 25%;</w:t>
+      </w:r>
+    </w:p>
+    <w:p>
+      <w:pPr>
+        <w:pStyle w:val="ListBullet"/>
+        <w:spacing w:after="60" w:line="276" w:lineRule="auto"/>
+      </w:pPr>
+      <w:r>
+        <w:rPr>
+          <w:rFonts w:ascii="Calibri" w:hAnsi="Calibri" w:eastAsia="Calibri"/>
+          <w:b w:val="0"/>
+          <w:color w:val="1A1A1A"/>
+          <w:sz w:val="22"/>
+        </w:rPr>
+        <w:t>насколько хорошо перепридуман сам процесс — 20%;</w:t>
+      </w:r>
+    </w:p>
+    <w:p>
+      <w:pPr>
+        <w:pStyle w:val="ListBullet"/>
+        <w:spacing w:after="60" w:line="276" w:lineRule="auto"/>
+      </w:pPr>
+      <w:r>
+        <w:rPr>
+          <w:rFonts w:ascii="Calibri" w:hAnsi="Calibri" w:eastAsia="Calibri"/>
+          <w:b w:val="0"/>
+          <w:color w:val="1A1A1A"/>
+          <w:sz w:val="22"/>
+        </w:rPr>
+        <w:t>масштабируемость и возможность довести до PROD — 15%;</w:t>
+      </w:r>
+    </w:p>
+    <w:p>
+      <w:pPr>
+        <w:pStyle w:val="ListBullet"/>
+        <w:spacing w:after="60" w:line="276" w:lineRule="auto"/>
+      </w:pPr>
+      <w:r>
+        <w:rPr>
+          <w:rFonts w:ascii="Calibri" w:hAnsi="Calibri" w:eastAsia="Calibri"/>
+          <w:b w:val="0"/>
+          <w:color w:val="1A1A1A"/>
+          <w:sz w:val="22"/>
+        </w:rPr>
+        <w:t>качество и понятность демонстрации — 10%.</w:t>
+      </w:r>
+    </w:p>
+    <w:p>
+      <w:pPr>
+        <w:spacing w:after="80" w:before="240" w:line="276" w:lineRule="auto"/>
+      </w:pPr>
+      <w:r>
+        <w:rPr>
+          <w:rFonts w:ascii="Calibri" w:hAnsi="Calibri" w:eastAsia="Calibri"/>
+          <w:b/>
+          <w:color w:val="1A1A1A"/>
+          <w:sz w:val="26"/>
+        </w:rPr>
+        <w:t>5.7. Призовой фонд</w:t>
+      </w:r>
+    </w:p>
+    <w:p>
+      <w:pPr>
+        <w:spacing w:after="160" w:before="0" w:line="276" w:lineRule="auto"/>
+      </w:pPr>
+      <w:r>
+        <w:rPr>
+          <w:rFonts w:ascii="Calibri" w:hAnsi="Calibri" w:eastAsia="Calibri"/>
+          <w:b w:val="0"/>
+          <w:color w:val="1A1A1A"/>
+          <w:sz w:val="22"/>
+        </w:rPr>
+        <w:t>Заложенный фонд — 200 000 ₽. Призы за результат на Demo Day:</w:t>
+      </w:r>
+    </w:p>
+    <w:p>
+      <w:pPr>
+        <w:pStyle w:val="ListBullet"/>
+        <w:spacing w:after="60" w:line="276" w:lineRule="auto"/>
+      </w:pPr>
+      <w:r>
+        <w:rPr>
+          <w:rFonts w:ascii="Calibri" w:hAnsi="Calibri" w:eastAsia="Calibri"/>
+          <w:b w:val="0"/>
+          <w:color w:val="1A1A1A"/>
+          <w:sz w:val="22"/>
+        </w:rPr>
+        <w:t>1 место — 100 000 ₽;</w:t>
+      </w:r>
+    </w:p>
+    <w:p>
+      <w:pPr>
+        <w:pStyle w:val="ListBullet"/>
+        <w:spacing w:after="60" w:line="276" w:lineRule="auto"/>
+      </w:pPr>
+      <w:r>
+        <w:rPr>
+          <w:rFonts w:ascii="Calibri" w:hAnsi="Calibri" w:eastAsia="Calibri"/>
+          <w:b w:val="0"/>
+          <w:color w:val="1A1A1A"/>
+          <w:sz w:val="22"/>
+        </w:rPr>
+        <w:t>2 место — 50 000 ₽;</w:t>
+      </w:r>
+    </w:p>
+    <w:p>
+      <w:pPr>
+        <w:pStyle w:val="ListBullet"/>
+        <w:spacing w:after="60" w:line="276" w:lineRule="auto"/>
+      </w:pPr>
+      <w:r>
+        <w:rPr>
+          <w:rFonts w:ascii="Calibri" w:hAnsi="Calibri" w:eastAsia="Calibri"/>
+          <w:b w:val="0"/>
+          <w:color w:val="1A1A1A"/>
+          <w:sz w:val="22"/>
+        </w:rPr>
+        <w:t>3 место — 30 000 ₽.</w:t>
+      </w:r>
+    </w:p>
+    <w:p>
+      <w:pPr>
+        <w:spacing w:after="160" w:before="0" w:line="276" w:lineRule="auto"/>
+      </w:pPr>
+      <w:r>
+        <w:rPr>
+          <w:rFonts w:ascii="Calibri" w:hAnsi="Calibri" w:eastAsia="Calibri"/>
+          <w:b w:val="0"/>
+          <w:color w:val="1A1A1A"/>
+          <w:sz w:val="22"/>
+        </w:rPr>
+        <w:t>Приз не означает внедрение. Решение по доработке или выводу в работу спонсоры принимают отдельно.</w:t>
+      </w:r>
+    </w:p>
+    <w:p>
+      <w:pPr>
+        <w:spacing w:after="120" w:before="320" w:line="276" w:lineRule="auto"/>
       </w:pPr>
       <w:r>
         <w:rPr>
@@ -1835,7 +2231,7 @@
     <w:p>
       <w:pPr>
         <w:pStyle w:val="ListBullet"/>
-        <w:spacing w:after="60"/>
+        <w:spacing w:after="60" w:line="276" w:lineRule="auto"/>
       </w:pPr>
       <w:r>
         <w:rPr>
@@ -1850,7 +2246,7 @@
     <w:p>
       <w:pPr>
         <w:pStyle w:val="ListBullet"/>
-        <w:spacing w:after="60"/>
+        <w:spacing w:after="60" w:line="276" w:lineRule="auto"/>
       </w:pPr>
       <w:r>
         <w:rPr>
@@ -1865,7 +2261,7 @@
     <w:p>
       <w:pPr>
         <w:pStyle w:val="ListBullet"/>
-        <w:spacing w:after="60"/>
+        <w:spacing w:after="60" w:line="276" w:lineRule="auto"/>
       </w:pPr>
       <w:r>
         <w:rPr>
@@ -1880,7 +2276,7 @@
     <w:p>
       <w:pPr>
         <w:pStyle w:val="ListBullet"/>
-        <w:spacing w:after="60"/>
+        <w:spacing w:after="60" w:line="276" w:lineRule="auto"/>
       </w:pPr>
       <w:r>
         <w:rPr>
@@ -1894,7 +2290,7 @@
     </w:p>
     <w:p>
       <w:pPr>
-        <w:spacing w:after="160" w:before="160" w:line="276" w:lineRule="auto"/>
+        <w:spacing w:after="120" w:before="320" w:line="276" w:lineRule="auto"/>
       </w:pPr>
       <w:r>
         <w:rPr>
@@ -1922,7 +2318,7 @@
     </w:p>
     <w:p>
       <w:pPr>
-        <w:spacing w:after="160" w:before="160" w:line="276" w:lineRule="auto"/>
+        <w:spacing w:after="120" w:before="320" w:line="276" w:lineRule="auto"/>
       </w:pPr>
       <w:r>
         <w:rPr>
@@ -2429,9 +2825,7 @@
             </w:tcBorders>
           </w:tcPr>
           <w:p>
-            <w:r>
-              <w:t>до 26 октября</w:t>
-            </w:r>
+            <w:r/>
             <w:r>
               <w:rPr>
                 <w:rFonts w:ascii="Calibri" w:hAnsi="Calibri" w:eastAsia="Calibri"/>
@@ -2439,6 +2833,7 @@
                 <w:color w:val="1A1A1A"/>
                 <w:sz w:val="20"/>
               </w:rPr>
+              <w:t>до 26 октября</w:t>
             </w:r>
           </w:p>
         </w:tc>
@@ -2486,7 +2881,7 @@
                 <w:color w:val="1A1A1A"/>
                 <w:sz w:val="20"/>
               </w:rPr>
-              <w:t>Одинаковые заявки для жюри</w:t>
+              <w:t>Восемь пунктов заявки уже в слайдах</w:t>
             </w:r>
           </w:p>
         </w:tc>
@@ -2574,9 +2969,7 @@
             </w:tcBorders>
           </w:tcPr>
           <w:p>
-            <w:r>
-              <w:t>Отбор 0–5 и веса Demo Day</w:t>
-            </w:r>
+            <w:r/>
             <w:r>
               <w:rPr>
                 <w:rFonts w:ascii="Calibri" w:hAnsi="Calibri" w:eastAsia="Calibri"/>
@@ -2584,6 +2977,7 @@
                 <w:color w:val="1A1A1A"/>
                 <w:sz w:val="20"/>
               </w:rPr>
+              <w:t>Пять критериев 0–5, +2 за кросс-функциональность, веса Demo Day</w:t>
             </w:r>
           </w:p>
         </w:tc>
@@ -2623,9 +3017,7 @@
             </w:tcBorders>
           </w:tcPr>
           <w:p>
-            <w:r>
-              <w:t>26 октября</w:t>
-            </w:r>
+            <w:r/>
             <w:r>
               <w:rPr>
                 <w:rFonts w:ascii="Calibri" w:hAnsi="Calibri" w:eastAsia="Calibri"/>
@@ -2633,6 +3025,7 @@
                 <w:color w:val="1A1A1A"/>
                 <w:sz w:val="20"/>
               </w:rPr>
+              <w:t>26 октября</w:t>
             </w:r>
           </w:p>
         </w:tc>
@@ -2718,9 +3111,7 @@
             </w:tcBorders>
           </w:tcPr>
           <w:p>
-            <w:r>
-              <w:t>27 октября</w:t>
-            </w:r>
+            <w:r/>
             <w:r>
               <w:rPr>
                 <w:rFonts w:ascii="Calibri" w:hAnsi="Calibri" w:eastAsia="Calibri"/>
@@ -2728,6 +3119,7 @@
                 <w:color w:val="1A1A1A"/>
                 <w:sz w:val="20"/>
               </w:rPr>
+              <w:t>27 октября</w:t>
             </w:r>
           </w:p>
         </w:tc>
@@ -2769,9 +3161,7 @@
             </w:tcBorders>
           </w:tcPr>
           <w:p>
-            <w:r>
-              <w:t>Одинаковый показ 11 ноября</w:t>
-            </w:r>
+            <w:r/>
             <w:r>
               <w:rPr>
                 <w:rFonts w:ascii="Calibri" w:hAnsi="Calibri" w:eastAsia="Calibri"/>
@@ -2779,6 +3169,7 @@
                 <w:color w:val="1A1A1A"/>
                 <w:sz w:val="20"/>
               </w:rPr>
+              <w:t>Одинаковый показ 11 ноября</w:t>
             </w:r>
           </w:p>
         </w:tc>
@@ -2818,9 +3209,7 @@
             </w:tcBorders>
           </w:tcPr>
           <w:p>
-            <w:r>
-              <w:t>до 10 ноября</w:t>
-            </w:r>
+            <w:r/>
             <w:r>
               <w:rPr>
                 <w:rFonts w:ascii="Calibri" w:hAnsi="Calibri" w:eastAsia="Calibri"/>
@@ -2828,6 +3217,7 @@
                 <w:color w:val="1A1A1A"/>
                 <w:sz w:val="20"/>
               </w:rPr>
+              <w:t>до 10 ноября</w:t>
             </w:r>
           </w:p>
         </w:tc>
@@ -2835,7 +3225,7 @@
     </w:tbl>
     <w:p>
       <w:pPr>
-        <w:spacing w:after="120"/>
+        <w:spacing w:after="80"/>
       </w:pPr>
     </w:p>
     <w:p>
@@ -2854,7 +3244,7 @@
     </w:p>
     <w:p>
       <w:pPr>
-        <w:spacing w:after="160" w:before="160" w:line="276" w:lineRule="auto"/>
+        <w:spacing w:after="120" w:before="320" w:line="276" w:lineRule="auto"/>
       </w:pPr>
       <w:r>
         <w:rPr>
@@ -2869,7 +3259,7 @@
     <w:p>
       <w:pPr>
         <w:pStyle w:val="ListBullet"/>
-        <w:spacing w:after="60"/>
+        <w:spacing w:after="60" w:line="276" w:lineRule="auto"/>
       </w:pPr>
       <w:r>
         <w:rPr>
@@ -2884,7 +3274,7 @@
     <w:p>
       <w:pPr>
         <w:pStyle w:val="ListBullet"/>
-        <w:spacing w:after="60"/>
+        <w:spacing w:after="60" w:line="276" w:lineRule="auto"/>
       </w:pPr>
       <w:r>
         <w:rPr>
@@ -2899,7 +3289,7 @@
     <w:p>
       <w:pPr>
         <w:pStyle w:val="ListBullet"/>
-        <w:spacing w:after="60"/>
+        <w:spacing w:after="60" w:line="276" w:lineRule="auto"/>
       </w:pPr>
       <w:r>
         <w:rPr>
@@ -2914,7 +3304,7 @@
     <w:p>
       <w:pPr>
         <w:pStyle w:val="ListBullet"/>
-        <w:spacing w:after="60"/>
+        <w:spacing w:after="60" w:line="276" w:lineRule="auto"/>
       </w:pPr>
       <w:r>
         <w:rPr>
@@ -2929,7 +3319,7 @@
     <w:p>
       <w:pPr>
         <w:pStyle w:val="ListBullet"/>
-        <w:spacing w:after="60"/>
+        <w:spacing w:after="60" w:line="276" w:lineRule="auto"/>
       </w:pPr>
       <w:r>
         <w:rPr>
@@ -2957,7 +3347,7 @@
     </w:p>
     <w:p>
       <w:pPr>
-        <w:spacing w:after="160" w:before="320" w:line="276" w:lineRule="auto"/>
+        <w:spacing w:after="160" w:before="360" w:line="276" w:lineRule="auto"/>
       </w:pPr>
       <w:r>
         <w:rPr>

</xml_diff>

<commit_message>
docs: drop the total prize pot from Challenge materials
Keep only the three place amounts so the slides do not advertise a 200k fund.

Co-authored-by: Cursor <cursoragent@cursor.com>
</commit_message>
<xml_diff>
--- a/Регламент AI Challenge.docx
+++ b/Регламент AI Challenge.docx
@@ -2124,7 +2124,7 @@
           <w:color w:val="1A1A1A"/>
           <w:sz w:val="26"/>
         </w:rPr>
-        <w:t>5.7. Призовой фонд</w:t>
+        <w:t>5.7. Призы</w:t>
       </w:r>
     </w:p>
     <w:p>
@@ -2138,7 +2138,7 @@
           <w:color w:val="1A1A1A"/>
           <w:sz w:val="22"/>
         </w:rPr>
-        <w:t>Заложенный фонд — 200 000 ₽. Призы за результат на Demo Day:</w:t>
+        <w:t>Призы за результат на Demo Day:</w:t>
       </w:r>
     </w:p>
     <w:p>

</xml_diff>

<commit_message>
docs: shift Challenge dates to 19 Oct–20 Nov
Start later, add an application cutoff, stretch the test tour, and move idea review and the final show to November.

Co-authored-by: Cursor <cursoragent@cursor.com>
</commit_message>
<xml_diff>
--- a/Регламент AI Challenge.docx
+++ b/Регламент AI Challenge.docx
@@ -55,7 +55,7 @@
           <w:color w:val="666666"/>
           <w:sz w:val="22"/>
         </w:rPr>
-        <w:t>Период: 8 октября — 11 ноября 2026. Документ для участников и организаторов. Открытые пункты помечены синим.</w:t>
+        <w:t>Период: 120 октября — 20 ноября 2026. Документ для участников и организаторов. Открытые пункты помечены синим.</w:t>
       </w:r>
     </w:p>
     <w:p>
@@ -139,7 +139,7 @@
           <w:color w:val="1A1A1A"/>
           <w:sz w:val="22"/>
         </w:rPr>
-        <w:t xml:space="preserve">Участие только одиночное: один человек — один проект. Можно брать свой процесс, кросс-функциональный или процесс другой функции, если хорошо понимаете, как он устроен, и можете предложить конкретное изменение. </w:t>
+        <w:t>Участие только одиночное: один человек — один проект. Можно брать свой процесс, кросс-функциональный или процесс другой функции, если хорошо понимаете, как он устроен, и можете предложить конкретное изменение. Порядок записи владелец объявит 120 октября.</w:t>
       </w:r>
       <w:r>
         <w:rPr>
@@ -148,7 +148,6 @@
           <w:color w:val="389BFF"/>
           <w:sz w:val="22"/>
         </w:rPr>
-        <w:t>Порядок записи владелец объявит 8 октября.</w:t>
       </w:r>
     </w:p>
     <w:p>
@@ -453,7 +452,9 @@
             </w:tcBorders>
           </w:tcPr>
           <w:p>
-            <w:r/>
+            <w:r>
+              <w:t>Обучение 20 октября и сопровождение практики</w:t>
+            </w:r>
             <w:r>
               <w:rPr>
                 <w:rFonts w:ascii="Calibri" w:hAnsi="Calibri" w:eastAsia="Calibri"/>
@@ -461,7 +462,6 @@
                 <w:color w:val="1A1A1A"/>
                 <w:sz w:val="20"/>
               </w:rPr>
-              <w:t>Обучение 9 октября и сопровождение практики</w:t>
             </w:r>
           </w:p>
         </w:tc>
@@ -607,7 +607,9 @@
             </w:tcBorders>
           </w:tcPr>
           <w:p>
-            <w:r/>
+            <w:r>
+              <w:t>Отбор идей 6 ноября и оценка на демодне</w:t>
+            </w:r>
             <w:r>
               <w:rPr>
                 <w:rFonts w:ascii="Calibri" w:hAnsi="Calibri" w:eastAsia="Calibri"/>
@@ -615,7 +617,6 @@
                 <w:color w:val="1A1A1A"/>
                 <w:sz w:val="20"/>
               </w:rPr>
-              <w:t>Отбор идей 26 октября и оценка на демодне</w:t>
             </w:r>
           </w:p>
         </w:tc>
@@ -882,7 +883,9 @@
             </w:tcBorders>
           </w:tcPr>
           <w:p>
-            <w:r/>
+            <w:r>
+              <w:t>120 октября</w:t>
+            </w:r>
             <w:r>
               <w:rPr>
                 <w:rFonts w:ascii="Calibri" w:hAnsi="Calibri" w:eastAsia="Calibri"/>
@@ -890,7 +893,6 @@
                 <w:color w:val="1A1A1A"/>
                 <w:sz w:val="20"/>
               </w:rPr>
-              <w:t>8 октября</w:t>
             </w:r>
           </w:p>
         </w:tc>
@@ -954,7 +956,9 @@
             </w:tcBorders>
           </w:tcPr>
           <w:p>
-            <w:r/>
+            <w:r>
+              <w:t>20 октября</w:t>
+            </w:r>
             <w:r>
               <w:rPr>
                 <w:rFonts w:ascii="Calibri" w:hAnsi="Calibri" w:eastAsia="Calibri"/>
@@ -962,7 +966,6 @@
                 <w:color w:val="1A1A1A"/>
                 <w:sz w:val="20"/>
               </w:rPr>
-              <w:t>9 октября</w:t>
             </w:r>
           </w:p>
         </w:tc>
@@ -1027,7 +1030,9 @@
             </w:tcBorders>
           </w:tcPr>
           <w:p>
-            <w:r/>
+            <w:r>
+              <w:t>22–30 октября</w:t>
+            </w:r>
             <w:r>
               <w:rPr>
                 <w:rFonts w:ascii="Calibri" w:hAnsi="Calibri" w:eastAsia="Calibri"/>
@@ -1035,7 +1040,6 @@
                 <w:color w:val="1A1A1A"/>
                 <w:sz w:val="20"/>
               </w:rPr>
-              <w:t>12–16 октября</w:t>
             </w:r>
           </w:p>
         </w:tc>
@@ -1099,7 +1103,9 @@
             </w:tcBorders>
           </w:tcPr>
           <w:p>
-            <w:r/>
+            <w:r>
+              <w:t>120 октября</w:t>
+            </w:r>
             <w:r>
               <w:rPr>
                 <w:rFonts w:ascii="Calibri" w:hAnsi="Calibri" w:eastAsia="Calibri"/>
@@ -1107,7 +1113,6 @@
                 <w:color w:val="1A1A1A"/>
                 <w:sz w:val="20"/>
               </w:rPr>
-              <w:t>19 октября</w:t>
             </w:r>
           </w:p>
         </w:tc>
@@ -1172,7 +1177,9 @@
             </w:tcBorders>
           </w:tcPr>
           <w:p>
-            <w:r/>
+            <w:r>
+              <w:t>до 6 ноября</w:t>
+            </w:r>
             <w:r>
               <w:rPr>
                 <w:rFonts w:ascii="Calibri" w:hAnsi="Calibri" w:eastAsia="Calibri"/>
@@ -1180,7 +1187,6 @@
                 <w:color w:val="1A1A1A"/>
                 <w:sz w:val="20"/>
               </w:rPr>
-              <w:t>19–26 октября</w:t>
             </w:r>
           </w:p>
         </w:tc>
@@ -1244,7 +1250,9 @@
             </w:tcBorders>
           </w:tcPr>
           <w:p>
-            <w:r/>
+            <w:r>
+              <w:t>6 ноября</w:t>
+            </w:r>
             <w:r>
               <w:rPr>
                 <w:rFonts w:ascii="Calibri" w:hAnsi="Calibri" w:eastAsia="Calibri"/>
@@ -1252,7 +1260,6 @@
                 <w:color w:val="1A1A1A"/>
                 <w:sz w:val="20"/>
               </w:rPr>
-              <w:t>26 октября</w:t>
             </w:r>
           </w:p>
         </w:tc>
@@ -1317,7 +1324,9 @@
             </w:tcBorders>
           </w:tcPr>
           <w:p>
-            <w:r/>
+            <w:r>
+              <w:t>7–19 ноября</w:t>
+            </w:r>
             <w:r>
               <w:rPr>
                 <w:rFonts w:ascii="Calibri" w:hAnsi="Calibri" w:eastAsia="Calibri"/>
@@ -1325,7 +1334,6 @@
                 <w:color w:val="1A1A1A"/>
                 <w:sz w:val="20"/>
               </w:rPr>
-              <w:t>27 октября — 10 ноября</w:t>
             </w:r>
           </w:p>
         </w:tc>
@@ -1389,7 +1397,9 @@
             </w:tcBorders>
           </w:tcPr>
           <w:p>
-            <w:r/>
+            <w:r>
+              <w:t>20 ноября</w:t>
+            </w:r>
             <w:r>
               <w:rPr>
                 <w:rFonts w:ascii="Calibri" w:hAnsi="Calibri" w:eastAsia="Calibri"/>
@@ -1397,7 +1407,6 @@
                 <w:color w:val="1A1A1A"/>
                 <w:sz w:val="20"/>
               </w:rPr>
-              <w:t>11 ноября</w:t>
             </w:r>
           </w:p>
         </w:tc>
@@ -1467,7 +1476,7 @@
           <w:color w:val="1A1A1A"/>
           <w:sz w:val="22"/>
         </w:rPr>
-        <w:t xml:space="preserve">В общий тур попадают те, кто сдал практику: минипроцесс собран на тестовом стенде и его можно показать. Список утверждает владелец вместе с ведущими обучения. </w:t>
+        <w:t>В общий тур попадают те, кто сдал практику: минипроцесс собран на тестовом стенде и его можно показать. Список утверждает владелец вместе с ведущими обучения. Пороговый критерий практики владелец публикует 120 октября.</w:t>
       </w:r>
       <w:r>
         <w:rPr>
@@ -1476,7 +1485,6 @@
           <w:color w:val="389BFF"/>
           <w:sz w:val="22"/>
         </w:rPr>
-        <w:t>Пороговый критерий практики владелец публикует 8 октября.</w:t>
       </w:r>
     </w:p>
     <w:p>
@@ -1504,7 +1512,7 @@
           <w:color w:val="1A1A1A"/>
           <w:sz w:val="26"/>
         </w:rPr>
-        <w:t>5.1. Обучение · 9 октября</w:t>
+        <w:t>5.1. Обучение · 20 октября</w:t>
       </w:r>
     </w:p>
     <w:p>
@@ -1532,7 +1540,7 @@
           <w:color w:val="1A1A1A"/>
           <w:sz w:val="26"/>
         </w:rPr>
-        <w:t>5.2. Практика / тестовое задание · 12–16 октября</w:t>
+        <w:t>5.2. Практика / тестовое задание · 22–30 октября</w:t>
       </w:r>
     </w:p>
     <w:p>
@@ -1560,7 +1568,7 @@
           <w:color w:val="1A1A1A"/>
           <w:sz w:val="26"/>
         </w:rPr>
-        <w:t>5.3. Идея · 19–26 октября</w:t>
+        <w:t>5.3. Идея · до 6 ноября</w:t>
       </w:r>
     </w:p>
     <w:p>
@@ -1750,7 +1758,7 @@
           <w:color w:val="1A1A1A"/>
           <w:sz w:val="26"/>
         </w:rPr>
-        <w:t>5.4. Представление идей и отбор · 26 октября</w:t>
+        <w:t>5.4. Представление идей и отбор · 6 ноября</w:t>
       </w:r>
     </w:p>
     <w:p>
@@ -1853,7 +1861,7 @@
           <w:color w:val="1A1A1A"/>
           <w:sz w:val="22"/>
         </w:rPr>
-        <w:t xml:space="preserve">За кросс-функциональное решение жюри даёт ещё +2 балла. Во второй этап проходят лучшие проекты, которые набрали минимально необходимое число баллов. Сколько проектов пойдёт дальше, зависит от числа заявок и их качества. </w:t>
+        <w:t>За кросс-функциональное решение жюри даёт ещё +2 балла. Во второй этап проходят лучшие проекты, которые набрали минимально необходимое число баллов. Сколько проектов пойдёт дальше, зависит от числа заявок и их качества. Пороговый балл владелец объявит до 6 ноября.</w:t>
       </w:r>
       <w:r>
         <w:rPr>
@@ -1862,7 +1870,6 @@
           <w:color w:val="389BFF"/>
           <w:sz w:val="22"/>
         </w:rPr>
-        <w:t>Пороговый балл владелец объявит до 26 октября.</w:t>
       </w:r>
     </w:p>
     <w:p>
@@ -1876,7 +1883,7 @@
           <w:color w:val="1A1A1A"/>
           <w:sz w:val="26"/>
         </w:rPr>
-        <w:t>5.5. Создание MVP · 27 октября — 10 ноября</w:t>
+        <w:t>5.5. Создание MVP · 7–19 ноября</w:t>
       </w:r>
     </w:p>
     <w:p>
@@ -1918,7 +1925,7 @@
           <w:color w:val="1A1A1A"/>
           <w:sz w:val="26"/>
         </w:rPr>
-        <w:t>5.6. Демодень · 11 ноября</w:t>
+        <w:t>5.6. Демодень · 20 ноября</w:t>
       </w:r>
     </w:p>
     <w:p>
@@ -2327,7 +2334,7 @@
           <w:color w:val="1A1A1A"/>
           <w:sz w:val="32"/>
         </w:rPr>
-        <w:t>8. Что ещё нужно до 8 октября</w:t>
+        <w:t>8. Что ещё нужно до 120 октября</w:t>
       </w:r>
     </w:p>
     <w:p>
@@ -2489,7 +2496,9 @@
             </w:tcBorders>
           </w:tcPr>
           <w:p>
-            <w:r/>
+            <w:r>
+              <w:t>Старт 120 октября</w:t>
+            </w:r>
             <w:r>
               <w:rPr>
                 <w:rFonts w:ascii="Calibri" w:hAnsi="Calibri" w:eastAsia="Calibri"/>
@@ -2497,7 +2506,6 @@
                 <w:color w:val="1A1A1A"/>
                 <w:sz w:val="20"/>
               </w:rPr>
-              <w:t>Старт 8 октября</w:t>
             </w:r>
           </w:p>
         </w:tc>
@@ -2535,7 +2543,9 @@
             </w:tcBorders>
           </w:tcPr>
           <w:p>
-            <w:r/>
+            <w:r>
+              <w:t>120 октября</w:t>
+            </w:r>
             <w:r>
               <w:rPr>
                 <w:rFonts w:ascii="Calibri" w:hAnsi="Calibri" w:eastAsia="Calibri"/>
@@ -2543,7 +2553,6 @@
                 <w:color w:val="1A1A1A"/>
                 <w:sz w:val="20"/>
               </w:rPr>
-              <w:t>8 октября</w:t>
             </w:r>
           </w:p>
         </w:tc>
@@ -2633,7 +2642,9 @@
             </w:tcBorders>
           </w:tcPr>
           <w:p>
-            <w:r/>
+            <w:r>
+              <w:t>8–20 октября</w:t>
+            </w:r>
             <w:r>
               <w:rPr>
                 <w:rFonts w:ascii="Calibri" w:hAnsi="Calibri" w:eastAsia="Calibri"/>
@@ -2641,7 +2652,6 @@
                 <w:color w:val="1A1A1A"/>
                 <w:sz w:val="20"/>
               </w:rPr>
-              <w:t>8–9 октября</w:t>
             </w:r>
           </w:p>
         </w:tc>
@@ -2727,7 +2737,9 @@
             </w:tcBorders>
           </w:tcPr>
           <w:p>
-            <w:r/>
+            <w:r>
+              <w:t>20 октября</w:t>
+            </w:r>
             <w:r>
               <w:rPr>
                 <w:rFonts w:ascii="Calibri" w:hAnsi="Calibri" w:eastAsia="Calibri"/>
@@ -2735,7 +2747,6 @@
                 <w:color w:val="1A1A1A"/>
                 <w:sz w:val="20"/>
               </w:rPr>
-              <w:t>9 октября</w:t>
             </w:r>
           </w:p>
         </w:tc>
@@ -2825,7 +2836,9 @@
             </w:tcBorders>
           </w:tcPr>
           <w:p>
-            <w:r/>
+            <w:r>
+              <w:t>до 6 ноября</w:t>
+            </w:r>
             <w:r>
               <w:rPr>
                 <w:rFonts w:ascii="Calibri" w:hAnsi="Calibri" w:eastAsia="Calibri"/>
@@ -2833,7 +2846,6 @@
                 <w:color w:val="1A1A1A"/>
                 <w:sz w:val="20"/>
               </w:rPr>
-              <w:t>до 26 октября</w:t>
             </w:r>
           </w:p>
         </w:tc>
@@ -2919,7 +2931,9 @@
             </w:tcBorders>
           </w:tcPr>
           <w:p>
-            <w:r/>
+            <w:r>
+              <w:t>120 октября</w:t>
+            </w:r>
             <w:r>
               <w:rPr>
                 <w:rFonts w:ascii="Calibri" w:hAnsi="Calibri" w:eastAsia="Calibri"/>
@@ -2927,7 +2941,6 @@
                 <w:color w:val="1A1A1A"/>
                 <w:sz w:val="20"/>
               </w:rPr>
-              <w:t>19 октября</w:t>
             </w:r>
           </w:p>
         </w:tc>
@@ -3017,7 +3030,9 @@
             </w:tcBorders>
           </w:tcPr>
           <w:p>
-            <w:r/>
+            <w:r>
+              <w:t>6 ноября</w:t>
+            </w:r>
             <w:r>
               <w:rPr>
                 <w:rFonts w:ascii="Calibri" w:hAnsi="Calibri" w:eastAsia="Calibri"/>
@@ -3025,7 +3040,6 @@
                 <w:color w:val="1A1A1A"/>
                 <w:sz w:val="20"/>
               </w:rPr>
-              <w:t>26 октября</w:t>
             </w:r>
           </w:p>
         </w:tc>
@@ -3161,7 +3175,9 @@
             </w:tcBorders>
           </w:tcPr>
           <w:p>
-            <w:r/>
+            <w:r>
+              <w:t>Одинаковый показ 20 ноября</w:t>
+            </w:r>
             <w:r>
               <w:rPr>
                 <w:rFonts w:ascii="Calibri" w:hAnsi="Calibri" w:eastAsia="Calibri"/>
@@ -3169,7 +3185,6 @@
                 <w:color w:val="1A1A1A"/>
                 <w:sz w:val="20"/>
               </w:rPr>
-              <w:t>Одинаковый показ 11 ноября</w:t>
             </w:r>
           </w:p>
         </w:tc>
@@ -3209,7 +3224,9 @@
             </w:tcBorders>
           </w:tcPr>
           <w:p>
-            <w:r/>
+            <w:r>
+              <w:t>до 19 ноября</w:t>
+            </w:r>
             <w:r>
               <w:rPr>
                 <w:rFonts w:ascii="Calibri" w:hAnsi="Calibri" w:eastAsia="Calibri"/>
@@ -3217,7 +3234,6 @@
                 <w:color w:val="1A1A1A"/>
                 <w:sz w:val="20"/>
               </w:rPr>
-              <w:t>до 10 ноября</w:t>
             </w:r>
           </w:p>
         </w:tc>
@@ -3239,7 +3255,7 @@
           <w:color w:val="1A1A1A"/>
           <w:sz w:val="22"/>
         </w:rPr>
-        <w:t>Сценарий обучения на 9 октября нужен ведущим, участникам его рассылать не обязательно.</w:t>
+        <w:t>Сценарий обучения на 20 октября нужен ведущим, участникам его рассылать не обязательно.</w:t>
       </w:r>
     </w:p>
     <w:p>
@@ -3356,7 +3372,7 @@
           <w:color w:val="666666"/>
           <w:sz w:val="20"/>
         </w:rPr>
-        <w:t>Основание: слайды AI Challenge, календарь 8 октября — 11 ноября, оргкоманда и правило контура Bitrix Dev / Work IT Dev.</w:t>
+        <w:t>Основание: слайды AI Challenge, календарь 120 октября — 20 ноября, оргкоманда и правило контура Bitrix Dev / Work IT Dev.</w:t>
       </w:r>
     </w:p>
     <w:sectPr>

</xml_diff>

<commit_message>
docs: rebuild regulation Word file with presentation dates
Replace the broken 120 October leftovers from a partial find-replace and keep the HTML calendar on 19 Oct–20 Nov.

Co-authored-by: Cursor <cursoragent@cursor.com>
</commit_message>
<xml_diff>
--- a/Регламент AI Challenge.docx
+++ b/Регламент AI Challenge.docx
@@ -13,7 +13,7 @@
           <w:color w:val="389BFF"/>
           <w:sz w:val="22"/>
         </w:rPr>
-        <w:t>Регламент · ОЦО и бэкофис · версия 7 октября 2026</w:t>
+        <w:t>Регламент · ОЦО и бэкофис · версия 18 октября 2026</w:t>
       </w:r>
     </w:p>
     <w:p>
@@ -55,7 +55,7 @@
           <w:color w:val="666666"/>
           <w:sz w:val="22"/>
         </w:rPr>
-        <w:t>Период: 120 октября — 20 ноября 2026. Документ для участников и организаторов. Открытые пункты помечены синим.</w:t>
+        <w:t>Период: 19 октября — 20 ноября 2026. Документ для участников и организаторов. Открытые пункты помечены синим.</w:t>
       </w:r>
     </w:p>
     <w:p>
@@ -139,15 +139,7 @@
           <w:color w:val="1A1A1A"/>
           <w:sz w:val="22"/>
         </w:rPr>
-        <w:t>Участие только одиночное: один человек — один проект. Можно брать свой процесс, кросс-функциональный или процесс другой функции, если хорошо понимаете, как он устроен, и можете предложить конкретное изменение. Порядок записи владелец объявит 120 октября.</w:t>
-      </w:r>
-      <w:r>
-        <w:rPr>
-          <w:rFonts w:ascii="Calibri" w:hAnsi="Calibri" w:eastAsia="Calibri"/>
-          <w:b w:val="0"/>
-          <w:color w:val="389BFF"/>
-          <w:sz w:val="22"/>
-        </w:rPr>
+        <w:t>Участие только одиночное: один человек — один проект. Можно брать свой процесс, кросс-функциональный или процесс другой функции, если хорошо понимаете, как он устроен, и можете предложить конкретное изменение. Заявку на участие нужно подать до 21 октября.</w:t>
       </w:r>
     </w:p>
     <w:p>
@@ -315,7 +307,7 @@
                 <w:color w:val="1A1A1A"/>
                 <w:sz w:val="20"/>
               </w:rPr>
-              <w:t>Решение по каждому MVP после демодня</w:t>
+              <w:t>Решение по каждому MVP после показа</w:t>
             </w:r>
           </w:p>
         </w:tc>
@@ -389,7 +381,7 @@
                 <w:color w:val="1A1A1A"/>
                 <w:sz w:val="20"/>
               </w:rPr>
-              <w:t>Правила, календарь, отбор, демодень, список общего тура</w:t>
+              <w:t>Правила, календарь, отбор, показ, список тестового тура</w:t>
             </w:r>
           </w:p>
         </w:tc>
@@ -452,9 +444,7 @@
             </w:tcBorders>
           </w:tcPr>
           <w:p>
-            <w:r>
-              <w:t>Обучение 20 октября и сопровождение практики</w:t>
-            </w:r>
+            <w:r/>
             <w:r>
               <w:rPr>
                 <w:rFonts w:ascii="Calibri" w:hAnsi="Calibri" w:eastAsia="Calibri"/>
@@ -462,6 +452,7 @@
                 <w:color w:val="1A1A1A"/>
                 <w:sz w:val="20"/>
               </w:rPr>
+              <w:t>Обучение 20 октября и сопровождение тестового тура</w:t>
             </w:r>
           </w:p>
         </w:tc>
@@ -607,9 +598,7 @@
             </w:tcBorders>
           </w:tcPr>
           <w:p>
-            <w:r>
-              <w:t>Отбор идей 6 ноября и оценка на демодне</w:t>
-            </w:r>
+            <w:r/>
             <w:r>
               <w:rPr>
                 <w:rFonts w:ascii="Calibri" w:hAnsi="Calibri" w:eastAsia="Calibri"/>
@@ -617,6 +606,7 @@
                 <w:color w:val="1A1A1A"/>
                 <w:sz w:val="20"/>
               </w:rPr>
+              <w:t>Просмотр идей 6 ноября и оценка на показе 20 ноября</w:t>
             </w:r>
           </w:p>
         </w:tc>
@@ -883,9 +873,7 @@
             </w:tcBorders>
           </w:tcPr>
           <w:p>
-            <w:r>
-              <w:t>120 октября</w:t>
-            </w:r>
+            <w:r/>
             <w:r>
               <w:rPr>
                 <w:rFonts w:ascii="Calibri" w:hAnsi="Calibri" w:eastAsia="Calibri"/>
@@ -893,6 +881,7 @@
                 <w:color w:val="1A1A1A"/>
                 <w:sz w:val="20"/>
               </w:rPr>
+              <w:t>19 октября</w:t>
             </w:r>
           </w:p>
         </w:tc>
@@ -915,7 +904,7 @@
                 <w:color w:val="1A1A1A"/>
                 <w:sz w:val="20"/>
               </w:rPr>
-              <w:t>Объявление</w:t>
+              <w:t>Начало</w:t>
             </w:r>
           </w:p>
         </w:tc>
@@ -956,9 +945,7 @@
             </w:tcBorders>
           </w:tcPr>
           <w:p>
-            <w:r>
-              <w:t>20 октября</w:t>
-            </w:r>
+            <w:r/>
             <w:r>
               <w:rPr>
                 <w:rFonts w:ascii="Calibri" w:hAnsi="Calibri" w:eastAsia="Calibri"/>
@@ -966,6 +953,7 @@
                 <w:color w:val="1A1A1A"/>
                 <w:sz w:val="20"/>
               </w:rPr>
+              <w:t>20 октября</w:t>
             </w:r>
           </w:p>
         </w:tc>
@@ -1030,9 +1018,7 @@
             </w:tcBorders>
           </w:tcPr>
           <w:p>
-            <w:r>
-              <w:t>22–30 октября</w:t>
-            </w:r>
+            <w:r/>
             <w:r>
               <w:rPr>
                 <w:rFonts w:ascii="Calibri" w:hAnsi="Calibri" w:eastAsia="Calibri"/>
@@ -1040,6 +1026,7 @@
                 <w:color w:val="1A1A1A"/>
                 <w:sz w:val="20"/>
               </w:rPr>
+              <w:t>до 21 октября</w:t>
             </w:r>
           </w:p>
         </w:tc>
@@ -1062,7 +1049,152 @@
                 <w:color w:val="1A1A1A"/>
                 <w:sz w:val="20"/>
               </w:rPr>
-              <w:t>Практика / тестовое задание</w:t>
+              <w:t>Сбор заявок</w:t>
+            </w:r>
+          </w:p>
+        </w:tc>
+        <w:tc>
+          <w:tcPr>
+            <w:tcW w:type="dxa" w:w="3249"/>
+            <w:tcBorders>
+              <w:top w:val="single" w:sz="4" w:color="D0D7DE"/>
+              <w:left w:val="single" w:sz="4" w:color="D0D7DE"/>
+              <w:bottom w:val="single" w:sz="4" w:color="D0D7DE"/>
+              <w:right w:val="single" w:sz="4" w:color="D0D7DE"/>
+            </w:tcBorders>
+          </w:tcPr>
+          <w:p>
+            <w:r/>
+            <w:r>
+              <w:rPr>
+                <w:rFonts w:ascii="Calibri" w:hAnsi="Calibri" w:eastAsia="Calibri"/>
+                <w:b w:val="0"/>
+                <w:color w:val="1A1A1A"/>
+                <w:sz w:val="20"/>
+              </w:rPr>
+              <w:t>Заявка на участие</w:t>
+            </w:r>
+          </w:p>
+        </w:tc>
+      </w:tr>
+      <w:tr>
+        <w:tc>
+          <w:tcPr>
+            <w:tcW w:type="dxa" w:w="3249"/>
+            <w:shd w:fill="F3F7FB" w:val="clear"/>
+            <w:tcBorders>
+              <w:top w:val="single" w:sz="4" w:color="D0D7DE"/>
+              <w:left w:val="single" w:sz="4" w:color="D0D7DE"/>
+              <w:bottom w:val="single" w:sz="4" w:color="D0D7DE"/>
+              <w:right w:val="single" w:sz="4" w:color="D0D7DE"/>
+            </w:tcBorders>
+          </w:tcPr>
+          <w:p>
+            <w:r/>
+            <w:r>
+              <w:rPr>
+                <w:rFonts w:ascii="Calibri" w:hAnsi="Calibri" w:eastAsia="Calibri"/>
+                <w:b w:val="0"/>
+                <w:color w:val="1A1A1A"/>
+                <w:sz w:val="20"/>
+              </w:rPr>
+              <w:t>22 октября</w:t>
+            </w:r>
+          </w:p>
+        </w:tc>
+        <w:tc>
+          <w:tcPr>
+            <w:tcW w:type="dxa" w:w="3249"/>
+            <w:shd w:fill="F3F7FB" w:val="clear"/>
+            <w:tcBorders>
+              <w:top w:val="single" w:sz="4" w:color="D0D7DE"/>
+              <w:left w:val="single" w:sz="4" w:color="D0D7DE"/>
+              <w:bottom w:val="single" w:sz="4" w:color="D0D7DE"/>
+              <w:right w:val="single" w:sz="4" w:color="D0D7DE"/>
+            </w:tcBorders>
+          </w:tcPr>
+          <w:p>
+            <w:r/>
+            <w:r>
+              <w:rPr>
+                <w:rFonts w:ascii="Calibri" w:hAnsi="Calibri" w:eastAsia="Calibri"/>
+                <w:b w:val="0"/>
+                <w:color w:val="1A1A1A"/>
+                <w:sz w:val="20"/>
+              </w:rPr>
+              <w:t>Выдача заданий</w:t>
+            </w:r>
+          </w:p>
+        </w:tc>
+        <w:tc>
+          <w:tcPr>
+            <w:tcW w:type="dxa" w:w="3249"/>
+            <w:shd w:fill="F3F7FB" w:val="clear"/>
+            <w:tcBorders>
+              <w:top w:val="single" w:sz="4" w:color="D0D7DE"/>
+              <w:left w:val="single" w:sz="4" w:color="D0D7DE"/>
+              <w:bottom w:val="single" w:sz="4" w:color="D0D7DE"/>
+              <w:right w:val="single" w:sz="4" w:color="D0D7DE"/>
+            </w:tcBorders>
+          </w:tcPr>
+          <w:p>
+            <w:r/>
+            <w:r>
+              <w:rPr>
+                <w:rFonts w:ascii="Calibri" w:hAnsi="Calibri" w:eastAsia="Calibri"/>
+                <w:b w:val="0"/>
+                <w:color w:val="1A1A1A"/>
+                <w:sz w:val="20"/>
+              </w:rPr>
+              <w:t>Задания тестового тура</w:t>
+            </w:r>
+          </w:p>
+        </w:tc>
+      </w:tr>
+      <w:tr>
+        <w:tc>
+          <w:tcPr>
+            <w:tcW w:type="dxa" w:w="3249"/>
+            <w:tcBorders>
+              <w:top w:val="single" w:sz="4" w:color="D0D7DE"/>
+              <w:left w:val="single" w:sz="4" w:color="D0D7DE"/>
+              <w:bottom w:val="single" w:sz="4" w:color="D0D7DE"/>
+              <w:right w:val="single" w:sz="4" w:color="D0D7DE"/>
+            </w:tcBorders>
+          </w:tcPr>
+          <w:p>
+            <w:r/>
+            <w:r>
+              <w:rPr>
+                <w:rFonts w:ascii="Calibri" w:hAnsi="Calibri" w:eastAsia="Calibri"/>
+                <w:b w:val="0"/>
+                <w:color w:val="1A1A1A"/>
+                <w:sz w:val="20"/>
+              </w:rPr>
+              <w:t>до 30 октября</w:t>
+            </w:r>
+          </w:p>
+        </w:tc>
+        <w:tc>
+          <w:tcPr>
+            <w:tcW w:type="dxa" w:w="3249"/>
+            <w:tcBorders>
+              <w:top w:val="single" w:sz="4" w:color="D0D7DE"/>
+              <w:left w:val="single" w:sz="4" w:color="D0D7DE"/>
+              <w:bottom w:val="single" w:sz="4" w:color="D0D7DE"/>
+              <w:right w:val="single" w:sz="4" w:color="D0D7DE"/>
+            </w:tcBorders>
+          </w:tcPr>
+          <w:p>
+            <w:r/>
+            <w:r>
+              <w:rPr>
+                <w:rFonts w:ascii="Calibri" w:hAnsi="Calibri" w:eastAsia="Calibri"/>
+                <w:b w:val="0"/>
+                <w:color w:val="1A1A1A"/>
+                <w:sz w:val="20"/>
+              </w:rPr>
+              <w:t>Тестовый тур</w:t>
             </w:r>
           </w:p>
         </w:tc>
@@ -1103,9 +1235,7 @@
             </w:tcBorders>
           </w:tcPr>
           <w:p>
-            <w:r>
-              <w:t>120 октября</w:t>
-            </w:r>
+            <w:r/>
             <w:r>
               <w:rPr>
                 <w:rFonts w:ascii="Calibri" w:hAnsi="Calibri" w:eastAsia="Calibri"/>
@@ -1113,6 +1243,7 @@
                 <w:color w:val="1A1A1A"/>
                 <w:sz w:val="20"/>
               </w:rPr>
+              <w:t>6 ноября</w:t>
             </w:r>
           </w:p>
         </w:tc>
@@ -1136,154 +1267,7 @@
                 <w:color w:val="1A1A1A"/>
                 <w:sz w:val="20"/>
               </w:rPr>
-              <w:t>Общий тур</w:t>
-            </w:r>
-          </w:p>
-        </w:tc>
-        <w:tc>
-          <w:tcPr>
-            <w:tcW w:type="dxa" w:w="3249"/>
-            <w:shd w:fill="F3F7FB" w:val="clear"/>
-            <w:tcBorders>
-              <w:top w:val="single" w:sz="4" w:color="D0D7DE"/>
-              <w:left w:val="single" w:sz="4" w:color="D0D7DE"/>
-              <w:bottom w:val="single" w:sz="4" w:color="D0D7DE"/>
-              <w:right w:val="single" w:sz="4" w:color="D0D7DE"/>
-            </w:tcBorders>
-          </w:tcPr>
-          <w:p>
-            <w:r/>
-            <w:r>
-              <w:rPr>
-                <w:rFonts w:ascii="Calibri" w:hAnsi="Calibri" w:eastAsia="Calibri"/>
-                <w:b w:val="0"/>
-                <w:color w:val="1A1A1A"/>
-                <w:sz w:val="20"/>
-              </w:rPr>
-              <w:t>Список тех, кто готовит идею</w:t>
-            </w:r>
-          </w:p>
-        </w:tc>
-      </w:tr>
-      <w:tr>
-        <w:tc>
-          <w:tcPr>
-            <w:tcW w:type="dxa" w:w="3249"/>
-            <w:tcBorders>
-              <w:top w:val="single" w:sz="4" w:color="D0D7DE"/>
-              <w:left w:val="single" w:sz="4" w:color="D0D7DE"/>
-              <w:bottom w:val="single" w:sz="4" w:color="D0D7DE"/>
-              <w:right w:val="single" w:sz="4" w:color="D0D7DE"/>
-            </w:tcBorders>
-          </w:tcPr>
-          <w:p>
-            <w:r>
-              <w:t>до 6 ноября</w:t>
-            </w:r>
-            <w:r>
-              <w:rPr>
-                <w:rFonts w:ascii="Calibri" w:hAnsi="Calibri" w:eastAsia="Calibri"/>
-                <w:b w:val="0"/>
-                <w:color w:val="1A1A1A"/>
-                <w:sz w:val="20"/>
-              </w:rPr>
-            </w:r>
-          </w:p>
-        </w:tc>
-        <w:tc>
-          <w:tcPr>
-            <w:tcW w:type="dxa" w:w="3249"/>
-            <w:tcBorders>
-              <w:top w:val="single" w:sz="4" w:color="D0D7DE"/>
-              <w:left w:val="single" w:sz="4" w:color="D0D7DE"/>
-              <w:bottom w:val="single" w:sz="4" w:color="D0D7DE"/>
-              <w:right w:val="single" w:sz="4" w:color="D0D7DE"/>
-            </w:tcBorders>
-          </w:tcPr>
-          <w:p>
-            <w:r/>
-            <w:r>
-              <w:rPr>
-                <w:rFonts w:ascii="Calibri" w:hAnsi="Calibri" w:eastAsia="Calibri"/>
-                <w:b w:val="0"/>
-                <w:color w:val="1A1A1A"/>
-                <w:sz w:val="20"/>
-              </w:rPr>
-              <w:t>Идея</w:t>
-            </w:r>
-          </w:p>
-        </w:tc>
-        <w:tc>
-          <w:tcPr>
-            <w:tcW w:type="dxa" w:w="3249"/>
-            <w:tcBorders>
-              <w:top w:val="single" w:sz="4" w:color="D0D7DE"/>
-              <w:left w:val="single" w:sz="4" w:color="D0D7DE"/>
-              <w:bottom w:val="single" w:sz="4" w:color="D0D7DE"/>
-              <w:right w:val="single" w:sz="4" w:color="D0D7DE"/>
-            </w:tcBorders>
-          </w:tcPr>
-          <w:p>
-            <w:r/>
-            <w:r>
-              <w:rPr>
-                <w:rFonts w:ascii="Calibri" w:hAnsi="Calibri" w:eastAsia="Calibri"/>
-                <w:b w:val="0"/>
-                <w:color w:val="1A1A1A"/>
-                <w:sz w:val="20"/>
-              </w:rPr>
-              <w:t>Описание процесса, изменения и ожидаемого эффекта</w:t>
-            </w:r>
-          </w:p>
-        </w:tc>
-      </w:tr>
-      <w:tr>
-        <w:tc>
-          <w:tcPr>
-            <w:tcW w:type="dxa" w:w="3249"/>
-            <w:shd w:fill="F3F7FB" w:val="clear"/>
-            <w:tcBorders>
-              <w:top w:val="single" w:sz="4" w:color="D0D7DE"/>
-              <w:left w:val="single" w:sz="4" w:color="D0D7DE"/>
-              <w:bottom w:val="single" w:sz="4" w:color="D0D7DE"/>
-              <w:right w:val="single" w:sz="4" w:color="D0D7DE"/>
-            </w:tcBorders>
-          </w:tcPr>
-          <w:p>
-            <w:r>
-              <w:t>6 ноября</w:t>
-            </w:r>
-            <w:r>
-              <w:rPr>
-                <w:rFonts w:ascii="Calibri" w:hAnsi="Calibri" w:eastAsia="Calibri"/>
-                <w:b w:val="0"/>
-                <w:color w:val="1A1A1A"/>
-                <w:sz w:val="20"/>
-              </w:rPr>
-            </w:r>
-          </w:p>
-        </w:tc>
-        <w:tc>
-          <w:tcPr>
-            <w:tcW w:type="dxa" w:w="3249"/>
-            <w:shd w:fill="F3F7FB" w:val="clear"/>
-            <w:tcBorders>
-              <w:top w:val="single" w:sz="4" w:color="D0D7DE"/>
-              <w:left w:val="single" w:sz="4" w:color="D0D7DE"/>
-              <w:bottom w:val="single" w:sz="4" w:color="D0D7DE"/>
-              <w:right w:val="single" w:sz="4" w:color="D0D7DE"/>
-            </w:tcBorders>
-          </w:tcPr>
-          <w:p>
-            <w:r/>
-            <w:r>
-              <w:rPr>
-                <w:rFonts w:ascii="Calibri" w:hAnsi="Calibri" w:eastAsia="Calibri"/>
-                <w:b w:val="0"/>
-                <w:color w:val="1A1A1A"/>
-                <w:sz w:val="20"/>
-              </w:rPr>
-              <w:t>Представление и отбор</w:t>
+              <w:t>Просмотр идей</w:t>
             </w:r>
           </w:p>
         </w:tc>
@@ -1324,9 +1308,7 @@
             </w:tcBorders>
           </w:tcPr>
           <w:p>
-            <w:r>
-              <w:t>7–19 ноября</w:t>
-            </w:r>
+            <w:r/>
             <w:r>
               <w:rPr>
                 <w:rFonts w:ascii="Calibri" w:hAnsi="Calibri" w:eastAsia="Calibri"/>
@@ -1334,6 +1316,7 @@
                 <w:color w:val="1A1A1A"/>
                 <w:sz w:val="20"/>
               </w:rPr>
+              <w:t>7–19 ноября</w:t>
             </w:r>
           </w:p>
         </w:tc>
@@ -1397,9 +1380,7 @@
             </w:tcBorders>
           </w:tcPr>
           <w:p>
-            <w:r>
-              <w:t>20 ноября</w:t>
-            </w:r>
+            <w:r/>
             <w:r>
               <w:rPr>
                 <w:rFonts w:ascii="Calibri" w:hAnsi="Calibri" w:eastAsia="Calibri"/>
@@ -1407,6 +1388,7 @@
                 <w:color w:val="1A1A1A"/>
                 <w:sz w:val="20"/>
               </w:rPr>
+              <w:t>20 ноября</w:t>
             </w:r>
           </w:p>
         </w:tc>
@@ -1430,7 +1412,7 @@
                 <w:color w:val="1A1A1A"/>
                 <w:sz w:val="20"/>
               </w:rPr>
-              <w:t>Демодень</w:t>
+              <w:t>Показ</w:t>
             </w:r>
           </w:p>
         </w:tc>
@@ -1476,15 +1458,7 @@
           <w:color w:val="1A1A1A"/>
           <w:sz w:val="22"/>
         </w:rPr>
-        <w:t>В общий тур попадают те, кто сдал практику: минипроцесс собран на тестовом стенде и его можно показать. Список утверждает владелец вместе с ведущими обучения. Пороговый критерий практики владелец публикует 120 октября.</w:t>
-      </w:r>
-      <w:r>
-        <w:rPr>
-          <w:rFonts w:ascii="Calibri" w:hAnsi="Calibri" w:eastAsia="Calibri"/>
-          <w:b w:val="0"/>
-          <w:color w:val="389BFF"/>
-          <w:sz w:val="22"/>
-        </w:rPr>
+        <w:t>В тестовый тур выходят те, кто подал заявку на участие до 21 октября. Дальше к просмотру идей идут те, кто сдал тестовый тур: минипроцесс собран на тестовом стенде и его можно показать. Список утверждает владелец вместе с ведущими обучения.</w:t>
       </w:r>
     </w:p>
     <w:p>
@@ -1540,7 +1514,7 @@
           <w:color w:val="1A1A1A"/>
           <w:sz w:val="26"/>
         </w:rPr>
-        <w:t>5.2. Практика / тестовое задание · 22–30 октября</w:t>
+        <w:t>5.2. Заявки на участие · до 21 октября</w:t>
       </w:r>
     </w:p>
     <w:p>
@@ -1554,7 +1528,7 @@
           <w:color w:val="1A1A1A"/>
           <w:sz w:val="22"/>
         </w:rPr>
-        <w:t>Каждый собирает свой минипроцесс в Битриксе на тестовом стенде. Агентов на этом этапе нет. Цель — первый самостоятельный результат и проверка, что формат подходит.</w:t>
+        <w:t>Чтобы выйти в тестовый тур, нужно подать заявку на участие до 21 октября.</w:t>
       </w:r>
     </w:p>
     <w:p>
@@ -1568,7 +1542,7 @@
           <w:color w:val="1A1A1A"/>
           <w:sz w:val="26"/>
         </w:rPr>
-        <w:t>5.3. Идея · до 6 ноября</w:t>
+        <w:t>5.3. Тестовый тур · 22–30 октября</w:t>
       </w:r>
     </w:p>
     <w:p>
@@ -1582,7 +1556,35 @@
           <w:color w:val="1A1A1A"/>
           <w:sz w:val="22"/>
         </w:rPr>
-        <w:t>Только участники общего тура. Участник выбирает процесс и предлагает, как выстроить его иначе. Можно свой процесс, кросс-функциональный или процесс другой функции. Можно предложить отказаться от процесса или его части, если понятно, как тогда будет решаться задача.</w:t>
+        <w:t>22 октября выдаём задания. Каждый собирает свой минипроцесс в Битриксе на тестовом стенде. Агентов на этом этапе нет. Цель — первый самостоятельный результат и проверка, что формат подходит.</w:t>
+      </w:r>
+    </w:p>
+    <w:p>
+      <w:pPr>
+        <w:spacing w:after="80" w:before="240" w:line="276" w:lineRule="auto"/>
+      </w:pPr>
+      <w:r>
+        <w:rPr>
+          <w:rFonts w:ascii="Calibri" w:hAnsi="Calibri" w:eastAsia="Calibri"/>
+          <w:b/>
+          <w:color w:val="1A1A1A"/>
+          <w:sz w:val="26"/>
+        </w:rPr>
+        <w:t>5.4. Идея и просмотр · 6 ноября</w:t>
+      </w:r>
+    </w:p>
+    <w:p>
+      <w:pPr>
+        <w:spacing w:after="160" w:before="0" w:line="276" w:lineRule="auto"/>
+      </w:pPr>
+      <w:r>
+        <w:rPr>
+          <w:rFonts w:ascii="Calibri" w:hAnsi="Calibri" w:eastAsia="Calibri"/>
+          <w:b w:val="0"/>
+          <w:color w:val="1A1A1A"/>
+          <w:sz w:val="22"/>
+        </w:rPr>
+        <w:t>Только те, кто сдал тестовый тур. Участник выбирает процесс и предлагает, как выстроить его иначе. Можно свой процесс, кросс-функциональный или процесс другой функции. Можно предложить отказаться от процесса или его части, если понятно, как тогда будет решаться задача.</w:t>
       </w:r>
     </w:p>
     <w:p>
@@ -1758,7 +1760,7 @@
           <w:color w:val="1A1A1A"/>
           <w:sz w:val="26"/>
         </w:rPr>
-        <w:t>5.4. Представление идей и отбор · 6 ноября</w:t>
+        <w:t>5.5. Представление идей и отбор · 6 ноября</w:t>
       </w:r>
     </w:p>
     <w:p>
@@ -1861,15 +1863,7 @@
           <w:color w:val="1A1A1A"/>
           <w:sz w:val="22"/>
         </w:rPr>
-        <w:t>За кросс-функциональное решение жюри даёт ещё +2 балла. Во второй этап проходят лучшие проекты, которые набрали минимально необходимое число баллов. Сколько проектов пойдёт дальше, зависит от числа заявок и их качества. Пороговый балл владелец объявит до 6 ноября.</w:t>
-      </w:r>
-      <w:r>
-        <w:rPr>
-          <w:rFonts w:ascii="Calibri" w:hAnsi="Calibri" w:eastAsia="Calibri"/>
-          <w:b w:val="0"/>
-          <w:color w:val="389BFF"/>
-          <w:sz w:val="22"/>
-        </w:rPr>
+        <w:t>За кросс-функциональное решение жюри даёт ещё +2 балла. Дальше идут те, кто набрал наибольшее количество баллов. Сколько проектов пойдёт дальше, зависит от числа заявок и их качества.</w:t>
       </w:r>
     </w:p>
     <w:p>
@@ -1883,7 +1877,7 @@
           <w:color w:val="1A1A1A"/>
           <w:sz w:val="26"/>
         </w:rPr>
-        <w:t>5.5. Создание MVP · 7–19 ноября</w:t>
+        <w:t>5.6. Создание MVP · 7–19 ноября</w:t>
       </w:r>
     </w:p>
     <w:p>
@@ -1911,7 +1905,7 @@
           <w:color w:val="1A1A1A"/>
           <w:sz w:val="22"/>
         </w:rPr>
-        <w:t>Контур: Bitrix Dev и Work IT Dev. В PROD прототип не выводится. Отдельное решение спонсоров нужно даже после успешного демодня.</w:t>
+        <w:t>Контур: Bitrix Dev и Work IT Dev. В PROD прототип не выводится. Отдельное решение спонсоров нужно даже после успешного показа.</w:t>
       </w:r>
     </w:p>
     <w:p>
@@ -1925,7 +1919,7 @@
           <w:color w:val="1A1A1A"/>
           <w:sz w:val="26"/>
         </w:rPr>
-        <w:t>5.6. Демодень · 20 ноября</w:t>
+        <w:t>5.7. Показ · 20 ноября</w:t>
       </w:r>
     </w:p>
     <w:p>
@@ -2028,7 +2022,7 @@
           <w:color w:val="1A1A1A"/>
           <w:sz w:val="22"/>
         </w:rPr>
-        <w:t>Если эффект оценочный — так и говорим, не выдаём его за измеренный. Вывод в PROD после демодня не автоматический: нужно отдельное решение спонсоров.</w:t>
+        <w:t>Если эффект оценочный — так и говорим, не выдаём его за измеренный. Вывод в PROD после показа не автоматический: нужно отдельное решение спонсоров.</w:t>
       </w:r>
     </w:p>
     <w:p>
@@ -2131,7 +2125,7 @@
           <w:color w:val="1A1A1A"/>
           <w:sz w:val="26"/>
         </w:rPr>
-        <w:t>5.7. Призы</w:t>
+        <w:t>5.8. Призы</w:t>
       </w:r>
     </w:p>
     <w:p>
@@ -2145,7 +2139,7 @@
           <w:color w:val="1A1A1A"/>
           <w:sz w:val="22"/>
         </w:rPr>
-        <w:t>Призы за результат на Demo Day:</w:t>
+        <w:t>Призы за результат на показе:</w:t>
       </w:r>
     </w:p>
     <w:p>
@@ -2247,7 +2241,7 @@
           <w:color w:val="1A1A1A"/>
           <w:sz w:val="22"/>
         </w:rPr>
-        <w:t>На практике агенты не используются.</w:t>
+        <w:t>На тестовом туре агенты не используются.</w:t>
       </w:r>
     </w:p>
     <w:p>
@@ -2306,7 +2300,7 @@
           <w:color w:val="1A1A1A"/>
           <w:sz w:val="32"/>
         </w:rPr>
-        <w:t>7. После демодня</w:t>
+        <w:t>7. После показа</w:t>
       </w:r>
     </w:p>
     <w:p>
@@ -2320,7 +2314,7 @@
           <w:color w:val="1A1A1A"/>
           <w:sz w:val="22"/>
         </w:rPr>
-        <w:t>По каждому MVP спонсоры отдельно решают: дорабатывать, готовить внедрение или завершить эксперимент. Автоматического вывода в работу нет. Срок решения спонсоры объявляют на демодне.</w:t>
+        <w:t>По каждому MVP спонсоры отдельно решают: дорабатывать, готовить внедрение или завершить эксперимент. Автоматического вывода в работу нет. Срок решения спонсоры объявляют на показе.</w:t>
       </w:r>
     </w:p>
     <w:p>
@@ -2334,7 +2328,7 @@
           <w:color w:val="1A1A1A"/>
           <w:sz w:val="32"/>
         </w:rPr>
-        <w:t>8. Что ещё нужно до 120 октября</w:t>
+        <w:t>8. Что ещё нужно до 19 октября</w:t>
       </w:r>
     </w:p>
     <w:p>
@@ -2496,9 +2490,7 @@
             </w:tcBorders>
           </w:tcPr>
           <w:p>
-            <w:r>
-              <w:t>Старт 120 октября</w:t>
-            </w:r>
+            <w:r/>
             <w:r>
               <w:rPr>
                 <w:rFonts w:ascii="Calibri" w:hAnsi="Calibri" w:eastAsia="Calibri"/>
@@ -2506,6 +2498,7 @@
                 <w:color w:val="1A1A1A"/>
                 <w:sz w:val="20"/>
               </w:rPr>
+              <w:t>Старт 19 октября</w:t>
             </w:r>
           </w:p>
         </w:tc>
@@ -2543,9 +2536,7 @@
             </w:tcBorders>
           </w:tcPr>
           <w:p>
-            <w:r>
-              <w:t>120 октября</w:t>
-            </w:r>
+            <w:r/>
             <w:r>
               <w:rPr>
                 <w:rFonts w:ascii="Calibri" w:hAnsi="Calibri" w:eastAsia="Calibri"/>
@@ -2553,6 +2544,7 @@
                 <w:color w:val="1A1A1A"/>
                 <w:sz w:val="20"/>
               </w:rPr>
+              <w:t>19 октября</w:t>
             </w:r>
           </w:p>
         </w:tc>
@@ -2642,9 +2634,7 @@
             </w:tcBorders>
           </w:tcPr>
           <w:p>
-            <w:r>
-              <w:t>8–20 октября</w:t>
-            </w:r>
+            <w:r/>
             <w:r>
               <w:rPr>
                 <w:rFonts w:ascii="Calibri" w:hAnsi="Calibri" w:eastAsia="Calibri"/>
@@ -2652,6 +2642,7 @@
                 <w:color w:val="1A1A1A"/>
                 <w:sz w:val="20"/>
               </w:rPr>
+              <w:t>19–20 октября</w:t>
             </w:r>
           </w:p>
         </w:tc>
@@ -2676,7 +2667,7 @@
                 <w:color w:val="1A1A1A"/>
                 <w:sz w:val="20"/>
               </w:rPr>
-              <w:t>Бриф практики</w:t>
+              <w:t>Бриф тестового тура</w:t>
             </w:r>
           </w:p>
         </w:tc>
@@ -2737,9 +2728,7 @@
             </w:tcBorders>
           </w:tcPr>
           <w:p>
-            <w:r>
-              <w:t>20 октября</w:t>
-            </w:r>
+            <w:r/>
             <w:r>
               <w:rPr>
                 <w:rFonts w:ascii="Calibri" w:hAnsi="Calibri" w:eastAsia="Calibri"/>
@@ -2747,6 +2736,7 @@
                 <w:color w:val="1A1A1A"/>
                 <w:sz w:val="20"/>
               </w:rPr>
+              <w:t>20 октября</w:t>
             </w:r>
           </w:p>
         </w:tc>
@@ -2796,7 +2786,7 @@
                 <w:color w:val="1A1A1A"/>
                 <w:sz w:val="20"/>
               </w:rPr>
-              <w:t>Отбор и демодень</w:t>
+              <w:t>Просмотр идей и показ</w:t>
             </w:r>
           </w:p>
         </w:tc>
@@ -2836,9 +2826,7 @@
             </w:tcBorders>
           </w:tcPr>
           <w:p>
-            <w:r>
-              <w:t>до 6 ноября</w:t>
-            </w:r>
+            <w:r/>
             <w:r>
               <w:rPr>
                 <w:rFonts w:ascii="Calibri" w:hAnsi="Calibri" w:eastAsia="Calibri"/>
@@ -2846,6 +2834,7 @@
                 <w:color w:val="1A1A1A"/>
                 <w:sz w:val="20"/>
               </w:rPr>
+              <w:t>до 6 ноября</w:t>
             </w:r>
           </w:p>
         </w:tc>
@@ -2931,9 +2920,7 @@
             </w:tcBorders>
           </w:tcPr>
           <w:p>
-            <w:r>
-              <w:t>120 октября</w:t>
-            </w:r>
+            <w:r/>
             <w:r>
               <w:rPr>
                 <w:rFonts w:ascii="Calibri" w:hAnsi="Calibri" w:eastAsia="Calibri"/>
@@ -2941,6 +2928,7 @@
                 <w:color w:val="1A1A1A"/>
                 <w:sz w:val="20"/>
               </w:rPr>
+              <w:t>30 октября</w:t>
             </w:r>
           </w:p>
         </w:tc>
@@ -2990,7 +2978,7 @@
                 <w:color w:val="1A1A1A"/>
                 <w:sz w:val="20"/>
               </w:rPr>
-              <w:t>Пять критериев 0–5, +2 за кросс-функциональность, веса Demo Day</w:t>
+              <w:t>Пять критериев 0–5, +2 за кросс-функциональность, веса показа</w:t>
             </w:r>
           </w:p>
         </w:tc>
@@ -3030,9 +3018,7 @@
             </w:tcBorders>
           </w:tcPr>
           <w:p>
-            <w:r>
-              <w:t>6 ноября</w:t>
-            </w:r>
+            <w:r/>
             <w:r>
               <w:rPr>
                 <w:rFonts w:ascii="Calibri" w:hAnsi="Calibri" w:eastAsia="Calibri"/>
@@ -3040,6 +3026,7 @@
                 <w:color w:val="1A1A1A"/>
                 <w:sz w:val="20"/>
               </w:rPr>
+              <w:t>6 ноября</w:t>
             </w:r>
           </w:p>
         </w:tc>
@@ -3133,7 +3120,7 @@
                 <w:color w:val="1A1A1A"/>
                 <w:sz w:val="20"/>
               </w:rPr>
-              <w:t>27 октября</w:t>
+              <w:t>7 ноября</w:t>
             </w:r>
           </w:p>
         </w:tc>
@@ -3175,9 +3162,7 @@
             </w:tcBorders>
           </w:tcPr>
           <w:p>
-            <w:r>
-              <w:t>Одинаковый показ 20 ноября</w:t>
-            </w:r>
+            <w:r/>
             <w:r>
               <w:rPr>
                 <w:rFonts w:ascii="Calibri" w:hAnsi="Calibri" w:eastAsia="Calibri"/>
@@ -3185,6 +3170,7 @@
                 <w:color w:val="1A1A1A"/>
                 <w:sz w:val="20"/>
               </w:rPr>
+              <w:t>Одинаковый показ 20 ноября</w:t>
             </w:r>
           </w:p>
         </w:tc>
@@ -3224,9 +3210,7 @@
             </w:tcBorders>
           </w:tcPr>
           <w:p>
-            <w:r>
-              <w:t>до 19 ноября</w:t>
-            </w:r>
+            <w:r/>
             <w:r>
               <w:rPr>
                 <w:rFonts w:ascii="Calibri" w:hAnsi="Calibri" w:eastAsia="Calibri"/>
@@ -3234,6 +3218,7 @@
                 <w:color w:val="1A1A1A"/>
                 <w:sz w:val="20"/>
               </w:rPr>
+              <w:t>до 19 ноября</w:t>
             </w:r>
           </w:p>
         </w:tc>
@@ -3299,7 +3284,7 @@
           <w:color w:val="1A1A1A"/>
           <w:sz w:val="22"/>
         </w:rPr>
-        <w:t>точный порог прохождения практики;</w:t>
+        <w:t>точный порог прохождения тестового тура;</w:t>
       </w:r>
     </w:p>
     <w:p>
@@ -3314,7 +3299,7 @@
           <w:color w:val="1A1A1A"/>
           <w:sz w:val="22"/>
         </w:rPr>
-        <w:t>пороговый балл отбора идей;</w:t>
+        <w:t>сколько проектов идёт в MVP;</w:t>
       </w:r>
     </w:p>
     <w:p>
@@ -3344,7 +3329,7 @@
           <w:color w:val="1A1A1A"/>
           <w:sz w:val="22"/>
         </w:rPr>
-        <w:t>срок решения спонсоров после демодня.</w:t>
+        <w:t>срок решения спонсоров после показа.</w:t>
       </w:r>
     </w:p>
     <w:p>
@@ -3372,7 +3357,7 @@
           <w:color w:val="666666"/>
           <w:sz w:val="20"/>
         </w:rPr>
-        <w:t>Основание: слайды AI Challenge, календарь 120 октября — 20 ноября, оргкоманда и правило контура Bitrix Dev / Work IT Dev.</w:t>
+        <w:t>Основание: слайды AI Challenge, календарь 19 октября — 20 ноября, оргкоманда и правило контура Bitrix Dev / Work IT Dev.</w:t>
       </w:r>
     </w:p>
     <w:sectPr>

</xml_diff>

<commit_message>
fix: split participation from idea and hide organizer notes
Natalya's review: no phone autofill, Иванова Наталья not a decision-maker, Elena approves the test-round list, and colleagues can apply without the unfinished Microsoft login.

Co-authored-by: Cursor <cursoragent@cursor.com>
</commit_message>
<xml_diff>
--- a/Регламент AI Challenge.docx
+++ b/Регламент AI Challenge.docx
@@ -13,7 +13,7 @@
           <w:color w:val="389BFF"/>
           <w:sz w:val="22"/>
         </w:rPr>
-        <w:t>Регламент · ОЦО и бэкофис · версия 18 октября 2026</w:t>
+        <w:t>Регламент · ОЦО и бэкофис · версия 20 октября 2026</w:t>
       </w:r>
     </w:p>
     <w:p>
@@ -55,7 +55,7 @@
           <w:color w:val="666666"/>
           <w:sz w:val="22"/>
         </w:rPr>
-        <w:t>Период: 19 октября — 20 ноября 2026. Документ для участников и организаторов. Открытые пункты помечены синим.</w:t>
+        <w:t>Период: 19 октября — 20 ноября 2026. Документ для участников.</w:t>
       </w:r>
     </w:p>
     <w:p>
@@ -390,77 +390,6 @@
         <w:tc>
           <w:tcPr>
             <w:tcW w:type="dxa" w:w="3249"/>
-            <w:tcBorders>
-              <w:top w:val="single" w:sz="4" w:color="D0D7DE"/>
-              <w:left w:val="single" w:sz="4" w:color="D0D7DE"/>
-              <w:bottom w:val="single" w:sz="4" w:color="D0D7DE"/>
-              <w:right w:val="single" w:sz="4" w:color="D0D7DE"/>
-            </w:tcBorders>
-          </w:tcPr>
-          <w:p>
-            <w:r/>
-            <w:r>
-              <w:rPr>
-                <w:rFonts w:ascii="Calibri" w:hAnsi="Calibri" w:eastAsia="Calibri"/>
-                <w:b w:val="0"/>
-                <w:color w:val="1A1A1A"/>
-                <w:sz w:val="20"/>
-              </w:rPr>
-              <w:t>Ведущие обучения</w:t>
-            </w:r>
-          </w:p>
-        </w:tc>
-        <w:tc>
-          <w:tcPr>
-            <w:tcW w:type="dxa" w:w="3249"/>
-            <w:tcBorders>
-              <w:top w:val="single" w:sz="4" w:color="D0D7DE"/>
-              <w:left w:val="single" w:sz="4" w:color="D0D7DE"/>
-              <w:bottom w:val="single" w:sz="4" w:color="D0D7DE"/>
-              <w:right w:val="single" w:sz="4" w:color="D0D7DE"/>
-            </w:tcBorders>
-          </w:tcPr>
-          <w:p>
-            <w:r/>
-            <w:r>
-              <w:rPr>
-                <w:rFonts w:ascii="Calibri" w:hAnsi="Calibri" w:eastAsia="Calibri"/>
-                <w:b w:val="0"/>
-                <w:color w:val="1A1A1A"/>
-                <w:sz w:val="20"/>
-              </w:rPr>
-              <w:t>Никишева Елена, Иванова Наталия</w:t>
-            </w:r>
-          </w:p>
-        </w:tc>
-        <w:tc>
-          <w:tcPr>
-            <w:tcW w:type="dxa" w:w="3249"/>
-            <w:tcBorders>
-              <w:top w:val="single" w:sz="4" w:color="D0D7DE"/>
-              <w:left w:val="single" w:sz="4" w:color="D0D7DE"/>
-              <w:bottom w:val="single" w:sz="4" w:color="D0D7DE"/>
-              <w:right w:val="single" w:sz="4" w:color="D0D7DE"/>
-            </w:tcBorders>
-          </w:tcPr>
-          <w:p>
-            <w:r/>
-            <w:r>
-              <w:rPr>
-                <w:rFonts w:ascii="Calibri" w:hAnsi="Calibri" w:eastAsia="Calibri"/>
-                <w:b w:val="0"/>
-                <w:color w:val="1A1A1A"/>
-                <w:sz w:val="20"/>
-              </w:rPr>
-              <w:t>Обучение 20 октября и сопровождение тестового тура</w:t>
-            </w:r>
-          </w:p>
-        </w:tc>
-      </w:tr>
-      <w:tr>
-        <w:tc>
-          <w:tcPr>
-            <w:tcW w:type="dxa" w:w="3249"/>
             <w:shd w:fill="F3F7FB" w:val="clear"/>
             <w:tcBorders>
               <w:top w:val="single" w:sz="4" w:color="D0D7DE"/>
@@ -566,24 +495,8 @@
             </w:tcBorders>
           </w:tcPr>
           <w:p>
-            <w:r/>
             <w:r>
-              <w:rPr>
-                <w:rFonts w:ascii="Calibri" w:hAnsi="Calibri" w:eastAsia="Calibri"/>
-                <w:b w:val="0"/>
-                <w:color w:val="1A1A1A"/>
-                <w:sz w:val="20"/>
-              </w:rPr>
-              <w:t xml:space="preserve">Топ-менеджмент компании. </w:t>
-            </w:r>
-            <w:r>
-              <w:rPr>
-                <w:rFonts w:ascii="Calibri" w:hAnsi="Calibri" w:eastAsia="Calibri"/>
-                <w:b w:val="0"/>
-                <w:color w:val="389BFF"/>
-                <w:sz w:val="20"/>
-              </w:rPr>
-              <w:t>Имена объявит владелец</w:t>
+              <w:t>Топ-менеджмент компании. Имена объявит Никишева Елена</w:t>
             </w:r>
           </w:p>
         </w:tc>
@@ -720,15 +633,8 @@
             </w:tcBorders>
           </w:tcPr>
           <w:p>
-            <w:r/>
             <w:r>
-              <w:rPr>
-                <w:rFonts w:ascii="Calibri" w:hAnsi="Calibri" w:eastAsia="Calibri"/>
-                <w:b w:val="0"/>
-                <w:color w:val="389BFF"/>
-                <w:sz w:val="20"/>
-              </w:rPr>
-              <w:t>Состав объявит владелец</w:t>
+              <w:t>Состав объявит Никишева Елена</w:t>
             </w:r>
           </w:p>
         </w:tc>
@@ -1041,15 +947,8 @@
             </w:tcBorders>
           </w:tcPr>
           <w:p>
-            <w:r/>
             <w:r>
-              <w:rPr>
-                <w:rFonts w:ascii="Calibri" w:hAnsi="Calibri" w:eastAsia="Calibri"/>
-                <w:b w:val="0"/>
-                <w:color w:val="1A1A1A"/>
-                <w:sz w:val="20"/>
-              </w:rPr>
-              <w:t>Сбор заявок</w:t>
+              <w:t>Сбор заявок на участие</w:t>
             </w:r>
           </w:p>
         </w:tc>
@@ -1064,15 +963,8 @@
             </w:tcBorders>
           </w:tcPr>
           <w:p>
-            <w:r/>
             <w:r>
-              <w:rPr>
-                <w:rFonts w:ascii="Calibri" w:hAnsi="Calibri" w:eastAsia="Calibri"/>
-                <w:b w:val="0"/>
-                <w:color w:val="1A1A1A"/>
-                <w:sz w:val="20"/>
-              </w:rPr>
-              <w:t>Заявка на участие</w:t>
+              <w:t>Короткая заявка на участие в тестовом туре</w:t>
             </w:r>
           </w:p>
         </w:tc>
@@ -1458,7 +1350,7 @@
           <w:color w:val="1A1A1A"/>
           <w:sz w:val="22"/>
         </w:rPr>
-        <w:t>В тестовый тур выходят те, кто подал заявку на участие до 21 октября. Дальше к просмотру идей идут те, кто сдал тестовый тур: минипроцесс собран на тестовом стенде и его можно показать. Список утверждает владелец вместе с ведущими обучения.</w:t>
+        <w:t>В тестовый тур выходят те, кто подал заявку на участие до 21 октября. Дальше к просмотру идей идут те, кто сдал тестовый тур: минипроцесс собран на тестовом стенде и его можно показать. Список тестового тура утверждает Никишева Елена.</w:t>
       </w:r>
     </w:p>
     <w:p>
@@ -1500,7 +1392,7 @@
           <w:color w:val="1A1A1A"/>
           <w:sz w:val="22"/>
         </w:rPr>
-        <w:t>Разбираем, как смотреть на процесс и какие инструменты можно использовать. Это не лекция «про нейросети».</w:t>
+        <w:t>Разбираем, как смотреть на процесс и какие инструменты можно использовать. Это не лекция «про нейросети». Обучение вели Никишева Елена и Иванова Наталья. Иванова Наталья участвует в челлендже на общих основаниях.</w:t>
       </w:r>
     </w:p>
     <w:p>
@@ -1514,7 +1406,7 @@
           <w:color w:val="1A1A1A"/>
           <w:sz w:val="26"/>
         </w:rPr>
-        <w:t>5.2. Заявки на участие · до 21 октября</w:t>
+        <w:t>5.2. Заявка на участие · до 21 октября</w:t>
       </w:r>
     </w:p>
     <w:p>
@@ -1528,7 +1420,7 @@
           <w:color w:val="1A1A1A"/>
           <w:sz w:val="22"/>
         </w:rPr>
-        <w:t>Чтобы выйти в тестовый тур, нужно подать заявку на участие до 21 октября.</w:t>
+        <w:t>Это короткая заявка «я участвую». Она не заменяет заявку на идею. Чтобы выйти в тестовый тур, нужно подать заявку на участие до 21 октября, 23:59 мск. Одна заявка на человека, корпоративная почта @krit.pro. Восемь пунктов идеи — другая заявка, к просмотру 6 ноября.</w:t>
       </w:r>
     </w:p>
     <w:p>
@@ -1570,7 +1462,7 @@
           <w:color w:val="1A1A1A"/>
           <w:sz w:val="26"/>
         </w:rPr>
-        <w:t>5.4. Идея и просмотр · 6 ноября</w:t>
+        <w:t>5.4. Заявка на идею и просмотр · 6 ноября</w:t>
       </w:r>
     </w:p>
     <w:p>
@@ -1584,7 +1476,7 @@
           <w:color w:val="1A1A1A"/>
           <w:sz w:val="22"/>
         </w:rPr>
-        <w:t>Только те, кто сдал тестовый тур. Участник выбирает процесс и предлагает, как выстроить его иначе. Можно свой процесс, кросс-функциональный или процесс другой функции. Можно предложить отказаться от процесса или его части, если понятно, как тогда будет решаться задача.</w:t>
+        <w:t>Это не заявка на участие из пункта 5.2. Заявку на идею подают только те, кто сдал тестовый тур. Участник выбирает процесс и предлагает, как выстроить его иначе. Можно свой процесс, кросс-функциональный или процесс другой функции. Можно предложить отказаться от процесса или его части, если понятно, как тогда будет решаться задача.</w:t>
       </w:r>
     </w:p>
     <w:p>
@@ -1598,7 +1490,7 @@
           <w:color w:val="1A1A1A"/>
           <w:sz w:val="22"/>
         </w:rPr>
-        <w:t>В заявке нужно коротко описать:</w:t>
+        <w:t>В заявке на идею нужно коротко описать восемь пунктов:</w:t>
       </w:r>
     </w:p>
     <w:p>
@@ -1732,7 +1624,7 @@
           <w:color w:val="1A1A1A"/>
           <w:sz w:val="22"/>
         </w:rPr>
-        <w:t>До подачи заявки можно обсудить идею с Никишевой Еленой. Задача ментора — помочь подумать и направить, не придумать решение за участника.</w:t>
+        <w:t>До подачи заявки на идею можно обсудить её с Никишевой Еленой. Задача ментора — помочь подумать и направить, не придумать решение за участника.</w:t>
       </w:r>
     </w:p>
     <w:p>
@@ -2319,1035 +2211,6 @@
     </w:p>
     <w:p>
       <w:pPr>
-        <w:spacing w:after="120" w:before="320" w:line="276" w:lineRule="auto"/>
-      </w:pPr>
-      <w:r>
-        <w:rPr>
-          <w:rFonts w:ascii="Calibri" w:hAnsi="Calibri" w:eastAsia="Calibri"/>
-          <w:b/>
-          <w:color w:val="1A1A1A"/>
-          <w:sz w:val="32"/>
-        </w:rPr>
-        <w:t>8. Что ещё нужно до 19 октября</w:t>
-      </w:r>
-    </w:p>
-    <w:p>
-      <w:pPr>
-        <w:spacing w:after="160" w:before="0" w:line="276" w:lineRule="auto"/>
-      </w:pPr>
-      <w:r>
-        <w:rPr>
-          <w:rFonts w:ascii="Calibri" w:hAnsi="Calibri" w:eastAsia="Calibri"/>
-          <w:b w:val="0"/>
-          <w:color w:val="1A1A1A"/>
-          <w:sz w:val="22"/>
-        </w:rPr>
-        <w:t>Регламент можно объявлять. Чтобы цикл не сорвался, не хватает коротких рабочих материалов — не новых «политик», а приложений к этому документу.</w:t>
-      </w:r>
-    </w:p>
-    <w:tbl>
-      <w:tblPr>
-        <w:tblW w:type="auto" w:w="0"/>
-        <w:tblLayout w:type="autofit"/>
-        <w:tblLook w:firstColumn="1" w:firstRow="1" w:lastColumn="0" w:lastRow="0" w:noHBand="0" w:noVBand="1" w:val="04A0"/>
-      </w:tblPr>
-      <w:tblGrid>
-        <w:gridCol w:w="2436"/>
-        <w:gridCol w:w="2436"/>
-        <w:gridCol w:w="2436"/>
-        <w:gridCol w:w="2436"/>
-      </w:tblGrid>
-      <w:tr>
-        <w:tc>
-          <w:tcPr>
-            <w:tcW w:type="dxa" w:w="2436"/>
-            <w:shd w:fill="389BFF" w:val="clear"/>
-            <w:tcBorders>
-              <w:top w:val="single" w:sz="4" w:color="D0D7DE"/>
-              <w:left w:val="single" w:sz="4" w:color="D0D7DE"/>
-              <w:bottom w:val="single" w:sz="4" w:color="D0D7DE"/>
-              <w:right w:val="single" w:sz="4" w:color="D0D7DE"/>
-            </w:tcBorders>
-          </w:tcPr>
-          <w:p>
-            <w:r/>
-            <w:r>
-              <w:rPr>
-                <w:rFonts w:ascii="Calibri" w:hAnsi="Calibri" w:eastAsia="Calibri"/>
-                <w:b/>
-                <w:color w:val="FFFFFF"/>
-                <w:sz w:val="20"/>
-              </w:rPr>
-              <w:t>Материал</w:t>
-            </w:r>
-          </w:p>
-        </w:tc>
-        <w:tc>
-          <w:tcPr>
-            <w:tcW w:type="dxa" w:w="2436"/>
-            <w:shd w:fill="389BFF" w:val="clear"/>
-            <w:tcBorders>
-              <w:top w:val="single" w:sz="4" w:color="D0D7DE"/>
-              <w:left w:val="single" w:sz="4" w:color="D0D7DE"/>
-              <w:bottom w:val="single" w:sz="4" w:color="D0D7DE"/>
-              <w:right w:val="single" w:sz="4" w:color="D0D7DE"/>
-            </w:tcBorders>
-          </w:tcPr>
-          <w:p>
-            <w:r/>
-            <w:r>
-              <w:rPr>
-                <w:rFonts w:ascii="Calibri" w:hAnsi="Calibri" w:eastAsia="Calibri"/>
-                <w:b/>
-                <w:color w:val="FFFFFF"/>
-                <w:sz w:val="20"/>
-              </w:rPr>
-              <w:t>Зачем</w:t>
-            </w:r>
-          </w:p>
-        </w:tc>
-        <w:tc>
-          <w:tcPr>
-            <w:tcW w:type="dxa" w:w="2436"/>
-            <w:shd w:fill="389BFF" w:val="clear"/>
-            <w:tcBorders>
-              <w:top w:val="single" w:sz="4" w:color="D0D7DE"/>
-              <w:left w:val="single" w:sz="4" w:color="D0D7DE"/>
-              <w:bottom w:val="single" w:sz="4" w:color="D0D7DE"/>
-              <w:right w:val="single" w:sz="4" w:color="D0D7DE"/>
-            </w:tcBorders>
-          </w:tcPr>
-          <w:p>
-            <w:r/>
-            <w:r>
-              <w:rPr>
-                <w:rFonts w:ascii="Calibri" w:hAnsi="Calibri" w:eastAsia="Calibri"/>
-                <w:b/>
-                <w:color w:val="FFFFFF"/>
-                <w:sz w:val="20"/>
-              </w:rPr>
-              <w:t>Кто</w:t>
-            </w:r>
-          </w:p>
-        </w:tc>
-        <w:tc>
-          <w:tcPr>
-            <w:tcW w:type="dxa" w:w="2436"/>
-            <w:shd w:fill="389BFF" w:val="clear"/>
-            <w:tcBorders>
-              <w:top w:val="single" w:sz="4" w:color="D0D7DE"/>
-              <w:left w:val="single" w:sz="4" w:color="D0D7DE"/>
-              <w:bottom w:val="single" w:sz="4" w:color="D0D7DE"/>
-              <w:right w:val="single" w:sz="4" w:color="D0D7DE"/>
-            </w:tcBorders>
-          </w:tcPr>
-          <w:p>
-            <w:r/>
-            <w:r>
-              <w:rPr>
-                <w:rFonts w:ascii="Calibri" w:hAnsi="Calibri" w:eastAsia="Calibri"/>
-                <w:b/>
-                <w:color w:val="FFFFFF"/>
-                <w:sz w:val="20"/>
-              </w:rPr>
-              <w:t>Когда нужно</w:t>
-            </w:r>
-          </w:p>
-        </w:tc>
-      </w:tr>
-      <w:tr>
-        <w:tc>
-          <w:tcPr>
-            <w:tcW w:type="dxa" w:w="2436"/>
-            <w:tcBorders>
-              <w:top w:val="single" w:sz="4" w:color="D0D7DE"/>
-              <w:left w:val="single" w:sz="4" w:color="D0D7DE"/>
-              <w:bottom w:val="single" w:sz="4" w:color="D0D7DE"/>
-              <w:right w:val="single" w:sz="4" w:color="D0D7DE"/>
-            </w:tcBorders>
-          </w:tcPr>
-          <w:p>
-            <w:r/>
-            <w:r>
-              <w:rPr>
-                <w:rFonts w:ascii="Calibri" w:hAnsi="Calibri" w:eastAsia="Calibri"/>
-                <w:b w:val="0"/>
-                <w:color w:val="1A1A1A"/>
-                <w:sz w:val="20"/>
-              </w:rPr>
-              <w:t>Письмо-объявление</w:t>
-            </w:r>
-          </w:p>
-        </w:tc>
-        <w:tc>
-          <w:tcPr>
-            <w:tcW w:type="dxa" w:w="2436"/>
-            <w:tcBorders>
-              <w:top w:val="single" w:sz="4" w:color="D0D7DE"/>
-              <w:left w:val="single" w:sz="4" w:color="D0D7DE"/>
-              <w:bottom w:val="single" w:sz="4" w:color="D0D7DE"/>
-              <w:right w:val="single" w:sz="4" w:color="D0D7DE"/>
-            </w:tcBorders>
-          </w:tcPr>
-          <w:p>
-            <w:r/>
-            <w:r>
-              <w:rPr>
-                <w:rFonts w:ascii="Calibri" w:hAnsi="Calibri" w:eastAsia="Calibri"/>
-                <w:b w:val="0"/>
-                <w:color w:val="1A1A1A"/>
-                <w:sz w:val="20"/>
-              </w:rPr>
-              <w:t>Старт 19 октября</w:t>
-            </w:r>
-          </w:p>
-        </w:tc>
-        <w:tc>
-          <w:tcPr>
-            <w:tcW w:type="dxa" w:w="2436"/>
-            <w:tcBorders>
-              <w:top w:val="single" w:sz="4" w:color="D0D7DE"/>
-              <w:left w:val="single" w:sz="4" w:color="D0D7DE"/>
-              <w:bottom w:val="single" w:sz="4" w:color="D0D7DE"/>
-              <w:right w:val="single" w:sz="4" w:color="D0D7DE"/>
-            </w:tcBorders>
-          </w:tcPr>
-          <w:p>
-            <w:r/>
-            <w:r>
-              <w:rPr>
-                <w:rFonts w:ascii="Calibri" w:hAnsi="Calibri" w:eastAsia="Calibri"/>
-                <w:b w:val="0"/>
-                <w:color w:val="1A1A1A"/>
-                <w:sz w:val="20"/>
-              </w:rPr>
-              <w:t>Никишева Елена</w:t>
-            </w:r>
-          </w:p>
-        </w:tc>
-        <w:tc>
-          <w:tcPr>
-            <w:tcW w:type="dxa" w:w="2436"/>
-            <w:tcBorders>
-              <w:top w:val="single" w:sz="4" w:color="D0D7DE"/>
-              <w:left w:val="single" w:sz="4" w:color="D0D7DE"/>
-              <w:bottom w:val="single" w:sz="4" w:color="D0D7DE"/>
-              <w:right w:val="single" w:sz="4" w:color="D0D7DE"/>
-            </w:tcBorders>
-          </w:tcPr>
-          <w:p>
-            <w:r/>
-            <w:r>
-              <w:rPr>
-                <w:rFonts w:ascii="Calibri" w:hAnsi="Calibri" w:eastAsia="Calibri"/>
-                <w:b w:val="0"/>
-                <w:color w:val="1A1A1A"/>
-                <w:sz w:val="20"/>
-              </w:rPr>
-              <w:t>19 октября</w:t>
-            </w:r>
-          </w:p>
-        </w:tc>
-      </w:tr>
-      <w:tr>
-        <w:tc>
-          <w:tcPr>
-            <w:tcW w:type="dxa" w:w="2436"/>
-            <w:shd w:fill="F3F7FB" w:val="clear"/>
-            <w:tcBorders>
-              <w:top w:val="single" w:sz="4" w:color="D0D7DE"/>
-              <w:left w:val="single" w:sz="4" w:color="D0D7DE"/>
-              <w:bottom w:val="single" w:sz="4" w:color="D0D7DE"/>
-              <w:right w:val="single" w:sz="4" w:color="D0D7DE"/>
-            </w:tcBorders>
-          </w:tcPr>
-          <w:p>
-            <w:r/>
-            <w:r>
-              <w:rPr>
-                <w:rFonts w:ascii="Calibri" w:hAnsi="Calibri" w:eastAsia="Calibri"/>
-                <w:b w:val="0"/>
-                <w:color w:val="1A1A1A"/>
-                <w:sz w:val="20"/>
-              </w:rPr>
-              <w:t>Инструкция доступов</w:t>
-            </w:r>
-          </w:p>
-        </w:tc>
-        <w:tc>
-          <w:tcPr>
-            <w:tcW w:type="dxa" w:w="2436"/>
-            <w:shd w:fill="F3F7FB" w:val="clear"/>
-            <w:tcBorders>
-              <w:top w:val="single" w:sz="4" w:color="D0D7DE"/>
-              <w:left w:val="single" w:sz="4" w:color="D0D7DE"/>
-              <w:bottom w:val="single" w:sz="4" w:color="D0D7DE"/>
-              <w:right w:val="single" w:sz="4" w:color="D0D7DE"/>
-            </w:tcBorders>
-          </w:tcPr>
-          <w:p>
-            <w:r/>
-            <w:r>
-              <w:rPr>
-                <w:rFonts w:ascii="Calibri" w:hAnsi="Calibri" w:eastAsia="Calibri"/>
-                <w:b w:val="0"/>
-                <w:color w:val="1A1A1A"/>
-                <w:sz w:val="20"/>
-              </w:rPr>
-              <w:t>Cursor, Bitrix Dev, Work IT Dev</w:t>
-            </w:r>
-          </w:p>
-        </w:tc>
-        <w:tc>
-          <w:tcPr>
-            <w:tcW w:type="dxa" w:w="2436"/>
-            <w:shd w:fill="F3F7FB" w:val="clear"/>
-            <w:tcBorders>
-              <w:top w:val="single" w:sz="4" w:color="D0D7DE"/>
-              <w:left w:val="single" w:sz="4" w:color="D0D7DE"/>
-              <w:bottom w:val="single" w:sz="4" w:color="D0D7DE"/>
-              <w:right w:val="single" w:sz="4" w:color="D0D7DE"/>
-            </w:tcBorders>
-          </w:tcPr>
-          <w:p>
-            <w:r/>
-            <w:r>
-              <w:rPr>
-                <w:rFonts w:ascii="Calibri" w:hAnsi="Calibri" w:eastAsia="Calibri"/>
-                <w:b w:val="0"/>
-                <w:color w:val="1A1A1A"/>
-                <w:sz w:val="20"/>
-              </w:rPr>
-              <w:t>Кривицкий Павел</w:t>
-            </w:r>
-          </w:p>
-        </w:tc>
-        <w:tc>
-          <w:tcPr>
-            <w:tcW w:type="dxa" w:w="2436"/>
-            <w:shd w:fill="F3F7FB" w:val="clear"/>
-            <w:tcBorders>
-              <w:top w:val="single" w:sz="4" w:color="D0D7DE"/>
-              <w:left w:val="single" w:sz="4" w:color="D0D7DE"/>
-              <w:bottom w:val="single" w:sz="4" w:color="D0D7DE"/>
-              <w:right w:val="single" w:sz="4" w:color="D0D7DE"/>
-            </w:tcBorders>
-          </w:tcPr>
-          <w:p>
-            <w:r/>
-            <w:r>
-              <w:rPr>
-                <w:rFonts w:ascii="Calibri" w:hAnsi="Calibri" w:eastAsia="Calibri"/>
-                <w:b w:val="0"/>
-                <w:color w:val="1A1A1A"/>
-                <w:sz w:val="20"/>
-              </w:rPr>
-              <w:t>19–20 октября</w:t>
-            </w:r>
-          </w:p>
-        </w:tc>
-      </w:tr>
-      <w:tr>
-        <w:tc>
-          <w:tcPr>
-            <w:tcW w:type="dxa" w:w="2436"/>
-            <w:tcBorders>
-              <w:top w:val="single" w:sz="4" w:color="D0D7DE"/>
-              <w:left w:val="single" w:sz="4" w:color="D0D7DE"/>
-              <w:bottom w:val="single" w:sz="4" w:color="D0D7DE"/>
-              <w:right w:val="single" w:sz="4" w:color="D0D7DE"/>
-            </w:tcBorders>
-          </w:tcPr>
-          <w:p>
-            <w:r/>
-            <w:r>
-              <w:rPr>
-                <w:rFonts w:ascii="Calibri" w:hAnsi="Calibri" w:eastAsia="Calibri"/>
-                <w:b w:val="0"/>
-                <w:color w:val="1A1A1A"/>
-                <w:sz w:val="20"/>
-              </w:rPr>
-              <w:t>Бриф тестового тура</w:t>
-            </w:r>
-          </w:p>
-        </w:tc>
-        <w:tc>
-          <w:tcPr>
-            <w:tcW w:type="dxa" w:w="2436"/>
-            <w:tcBorders>
-              <w:top w:val="single" w:sz="4" w:color="D0D7DE"/>
-              <w:left w:val="single" w:sz="4" w:color="D0D7DE"/>
-              <w:bottom w:val="single" w:sz="4" w:color="D0D7DE"/>
-              <w:right w:val="single" w:sz="4" w:color="D0D7DE"/>
-            </w:tcBorders>
-          </w:tcPr>
-          <w:p>
-            <w:r/>
-            <w:r>
-              <w:rPr>
-                <w:rFonts w:ascii="Calibri" w:hAnsi="Calibri" w:eastAsia="Calibri"/>
-                <w:b w:val="0"/>
-                <w:color w:val="1A1A1A"/>
-                <w:sz w:val="20"/>
-              </w:rPr>
-              <w:t>Что считать сданным минипроцессом</w:t>
-            </w:r>
-          </w:p>
-        </w:tc>
-        <w:tc>
-          <w:tcPr>
-            <w:tcW w:type="dxa" w:w="2436"/>
-            <w:tcBorders>
-              <w:top w:val="single" w:sz="4" w:color="D0D7DE"/>
-              <w:left w:val="single" w:sz="4" w:color="D0D7DE"/>
-              <w:bottom w:val="single" w:sz="4" w:color="D0D7DE"/>
-              <w:right w:val="single" w:sz="4" w:color="D0D7DE"/>
-            </w:tcBorders>
-          </w:tcPr>
-          <w:p>
-            <w:r/>
-            <w:r>
-              <w:rPr>
-                <w:rFonts w:ascii="Calibri" w:hAnsi="Calibri" w:eastAsia="Calibri"/>
-                <w:b w:val="0"/>
-                <w:color w:val="1A1A1A"/>
-                <w:sz w:val="20"/>
-              </w:rPr>
-              <w:t>Никишева Елена, Иванова Наталия</w:t>
-            </w:r>
-          </w:p>
-        </w:tc>
-        <w:tc>
-          <w:tcPr>
-            <w:tcW w:type="dxa" w:w="2436"/>
-            <w:tcBorders>
-              <w:top w:val="single" w:sz="4" w:color="D0D7DE"/>
-              <w:left w:val="single" w:sz="4" w:color="D0D7DE"/>
-              <w:bottom w:val="single" w:sz="4" w:color="D0D7DE"/>
-              <w:right w:val="single" w:sz="4" w:color="D0D7DE"/>
-            </w:tcBorders>
-          </w:tcPr>
-          <w:p>
-            <w:r/>
-            <w:r>
-              <w:rPr>
-                <w:rFonts w:ascii="Calibri" w:hAnsi="Calibri" w:eastAsia="Calibri"/>
-                <w:b w:val="0"/>
-                <w:color w:val="1A1A1A"/>
-                <w:sz w:val="20"/>
-              </w:rPr>
-              <w:t>20 октября</w:t>
-            </w:r>
-          </w:p>
-        </w:tc>
-      </w:tr>
-      <w:tr>
-        <w:tc>
-          <w:tcPr>
-            <w:tcW w:type="dxa" w:w="2436"/>
-            <w:shd w:fill="F3F7FB" w:val="clear"/>
-            <w:tcBorders>
-              <w:top w:val="single" w:sz="4" w:color="D0D7DE"/>
-              <w:left w:val="single" w:sz="4" w:color="D0D7DE"/>
-              <w:bottom w:val="single" w:sz="4" w:color="D0D7DE"/>
-              <w:right w:val="single" w:sz="4" w:color="D0D7DE"/>
-            </w:tcBorders>
-          </w:tcPr>
-          <w:p>
-            <w:r/>
-            <w:r>
-              <w:rPr>
-                <w:rFonts w:ascii="Calibri" w:hAnsi="Calibri" w:eastAsia="Calibri"/>
-                <w:b w:val="0"/>
-                <w:color w:val="1A1A1A"/>
-                <w:sz w:val="20"/>
-              </w:rPr>
-              <w:t>Состав жюри</w:t>
-            </w:r>
-          </w:p>
-        </w:tc>
-        <w:tc>
-          <w:tcPr>
-            <w:tcW w:type="dxa" w:w="2436"/>
-            <w:shd w:fill="F3F7FB" w:val="clear"/>
-            <w:tcBorders>
-              <w:top w:val="single" w:sz="4" w:color="D0D7DE"/>
-              <w:left w:val="single" w:sz="4" w:color="D0D7DE"/>
-              <w:bottom w:val="single" w:sz="4" w:color="D0D7DE"/>
-              <w:right w:val="single" w:sz="4" w:color="D0D7DE"/>
-            </w:tcBorders>
-          </w:tcPr>
-          <w:p>
-            <w:r/>
-            <w:r>
-              <w:rPr>
-                <w:rFonts w:ascii="Calibri" w:hAnsi="Calibri" w:eastAsia="Calibri"/>
-                <w:b w:val="0"/>
-                <w:color w:val="1A1A1A"/>
-                <w:sz w:val="20"/>
-              </w:rPr>
-              <w:t>Просмотр идей и показ</w:t>
-            </w:r>
-          </w:p>
-        </w:tc>
-        <w:tc>
-          <w:tcPr>
-            <w:tcW w:type="dxa" w:w="2436"/>
-            <w:shd w:fill="F3F7FB" w:val="clear"/>
-            <w:tcBorders>
-              <w:top w:val="single" w:sz="4" w:color="D0D7DE"/>
-              <w:left w:val="single" w:sz="4" w:color="D0D7DE"/>
-              <w:bottom w:val="single" w:sz="4" w:color="D0D7DE"/>
-              <w:right w:val="single" w:sz="4" w:color="D0D7DE"/>
-            </w:tcBorders>
-          </w:tcPr>
-          <w:p>
-            <w:r/>
-            <w:r>
-              <w:rPr>
-                <w:rFonts w:ascii="Calibri" w:hAnsi="Calibri" w:eastAsia="Calibri"/>
-                <w:b w:val="0"/>
-                <w:color w:val="1A1A1A"/>
-                <w:sz w:val="20"/>
-              </w:rPr>
-              <w:t>Никишева Елена</w:t>
-            </w:r>
-          </w:p>
-        </w:tc>
-        <w:tc>
-          <w:tcPr>
-            <w:tcW w:type="dxa" w:w="2436"/>
-            <w:shd w:fill="F3F7FB" w:val="clear"/>
-            <w:tcBorders>
-              <w:top w:val="single" w:sz="4" w:color="D0D7DE"/>
-              <w:left w:val="single" w:sz="4" w:color="D0D7DE"/>
-              <w:bottom w:val="single" w:sz="4" w:color="D0D7DE"/>
-              <w:right w:val="single" w:sz="4" w:color="D0D7DE"/>
-            </w:tcBorders>
-          </w:tcPr>
-          <w:p>
-            <w:r/>
-            <w:r>
-              <w:rPr>
-                <w:rFonts w:ascii="Calibri" w:hAnsi="Calibri" w:eastAsia="Calibri"/>
-                <w:b w:val="0"/>
-                <w:color w:val="1A1A1A"/>
-                <w:sz w:val="20"/>
-              </w:rPr>
-              <w:t>до 6 ноября</w:t>
-            </w:r>
-          </w:p>
-        </w:tc>
-      </w:tr>
-      <w:tr>
-        <w:tc>
-          <w:tcPr>
-            <w:tcW w:type="dxa" w:w="2436"/>
-            <w:tcBorders>
-              <w:top w:val="single" w:sz="4" w:color="D0D7DE"/>
-              <w:left w:val="single" w:sz="4" w:color="D0D7DE"/>
-              <w:bottom w:val="single" w:sz="4" w:color="D0D7DE"/>
-              <w:right w:val="single" w:sz="4" w:color="D0D7DE"/>
-            </w:tcBorders>
-          </w:tcPr>
-          <w:p>
-            <w:r/>
-            <w:r>
-              <w:rPr>
-                <w:rFonts w:ascii="Calibri" w:hAnsi="Calibri" w:eastAsia="Calibri"/>
-                <w:b w:val="0"/>
-                <w:color w:val="1A1A1A"/>
-                <w:sz w:val="20"/>
-              </w:rPr>
-              <w:t>Форма идеи</w:t>
-            </w:r>
-          </w:p>
-        </w:tc>
-        <w:tc>
-          <w:tcPr>
-            <w:tcW w:type="dxa" w:w="2436"/>
-            <w:tcBorders>
-              <w:top w:val="single" w:sz="4" w:color="D0D7DE"/>
-              <w:left w:val="single" w:sz="4" w:color="D0D7DE"/>
-              <w:bottom w:val="single" w:sz="4" w:color="D0D7DE"/>
-              <w:right w:val="single" w:sz="4" w:color="D0D7DE"/>
-            </w:tcBorders>
-          </w:tcPr>
-          <w:p>
-            <w:r/>
-            <w:r>
-              <w:rPr>
-                <w:rFonts w:ascii="Calibri" w:hAnsi="Calibri" w:eastAsia="Calibri"/>
-                <w:b w:val="0"/>
-                <w:color w:val="1A1A1A"/>
-                <w:sz w:val="20"/>
-              </w:rPr>
-              <w:t>Восемь пунктов заявки уже в слайдах</w:t>
-            </w:r>
-          </w:p>
-        </w:tc>
-        <w:tc>
-          <w:tcPr>
-            <w:tcW w:type="dxa" w:w="2436"/>
-            <w:tcBorders>
-              <w:top w:val="single" w:sz="4" w:color="D0D7DE"/>
-              <w:left w:val="single" w:sz="4" w:color="D0D7DE"/>
-              <w:bottom w:val="single" w:sz="4" w:color="D0D7DE"/>
-              <w:right w:val="single" w:sz="4" w:color="D0D7DE"/>
-            </w:tcBorders>
-          </w:tcPr>
-          <w:p>
-            <w:r/>
-            <w:r>
-              <w:rPr>
-                <w:rFonts w:ascii="Calibri" w:hAnsi="Calibri" w:eastAsia="Calibri"/>
-                <w:b w:val="0"/>
-                <w:color w:val="1A1A1A"/>
-                <w:sz w:val="20"/>
-              </w:rPr>
-              <w:t>Никишева Елена</w:t>
-            </w:r>
-          </w:p>
-        </w:tc>
-        <w:tc>
-          <w:tcPr>
-            <w:tcW w:type="dxa" w:w="2436"/>
-            <w:tcBorders>
-              <w:top w:val="single" w:sz="4" w:color="D0D7DE"/>
-              <w:left w:val="single" w:sz="4" w:color="D0D7DE"/>
-              <w:bottom w:val="single" w:sz="4" w:color="D0D7DE"/>
-              <w:right w:val="single" w:sz="4" w:color="D0D7DE"/>
-            </w:tcBorders>
-          </w:tcPr>
-          <w:p>
-            <w:r/>
-            <w:r>
-              <w:rPr>
-                <w:rFonts w:ascii="Calibri" w:hAnsi="Calibri" w:eastAsia="Calibri"/>
-                <w:b w:val="0"/>
-                <w:color w:val="1A1A1A"/>
-                <w:sz w:val="20"/>
-              </w:rPr>
-              <w:t>30 октября</w:t>
-            </w:r>
-          </w:p>
-        </w:tc>
-      </w:tr>
-      <w:tr>
-        <w:tc>
-          <w:tcPr>
-            <w:tcW w:type="dxa" w:w="2436"/>
-            <w:shd w:fill="F3F7FB" w:val="clear"/>
-            <w:tcBorders>
-              <w:top w:val="single" w:sz="4" w:color="D0D7DE"/>
-              <w:left w:val="single" w:sz="4" w:color="D0D7DE"/>
-              <w:bottom w:val="single" w:sz="4" w:color="D0D7DE"/>
-              <w:right w:val="single" w:sz="4" w:color="D0D7DE"/>
-            </w:tcBorders>
-          </w:tcPr>
-          <w:p>
-            <w:r/>
-            <w:r>
-              <w:rPr>
-                <w:rFonts w:ascii="Calibri" w:hAnsi="Calibri" w:eastAsia="Calibri"/>
-                <w:b w:val="0"/>
-                <w:color w:val="1A1A1A"/>
-                <w:sz w:val="20"/>
-              </w:rPr>
-              <w:t>Лист оценки жюри</w:t>
-            </w:r>
-          </w:p>
-        </w:tc>
-        <w:tc>
-          <w:tcPr>
-            <w:tcW w:type="dxa" w:w="2436"/>
-            <w:shd w:fill="F3F7FB" w:val="clear"/>
-            <w:tcBorders>
-              <w:top w:val="single" w:sz="4" w:color="D0D7DE"/>
-              <w:left w:val="single" w:sz="4" w:color="D0D7DE"/>
-              <w:bottom w:val="single" w:sz="4" w:color="D0D7DE"/>
-              <w:right w:val="single" w:sz="4" w:color="D0D7DE"/>
-            </w:tcBorders>
-          </w:tcPr>
-          <w:p>
-            <w:r/>
-            <w:r>
-              <w:rPr>
-                <w:rFonts w:ascii="Calibri" w:hAnsi="Calibri" w:eastAsia="Calibri"/>
-                <w:b w:val="0"/>
-                <w:color w:val="1A1A1A"/>
-                <w:sz w:val="20"/>
-              </w:rPr>
-              <w:t>Пять критериев 0–5, +2 за кросс-функциональность, веса показа</w:t>
-            </w:r>
-          </w:p>
-        </w:tc>
-        <w:tc>
-          <w:tcPr>
-            <w:tcW w:type="dxa" w:w="2436"/>
-            <w:shd w:fill="F3F7FB" w:val="clear"/>
-            <w:tcBorders>
-              <w:top w:val="single" w:sz="4" w:color="D0D7DE"/>
-              <w:left w:val="single" w:sz="4" w:color="D0D7DE"/>
-              <w:bottom w:val="single" w:sz="4" w:color="D0D7DE"/>
-              <w:right w:val="single" w:sz="4" w:color="D0D7DE"/>
-            </w:tcBorders>
-          </w:tcPr>
-          <w:p>
-            <w:r/>
-            <w:r>
-              <w:rPr>
-                <w:rFonts w:ascii="Calibri" w:hAnsi="Calibri" w:eastAsia="Calibri"/>
-                <w:b w:val="0"/>
-                <w:color w:val="1A1A1A"/>
-                <w:sz w:val="20"/>
-              </w:rPr>
-              <w:t>Никишева Елена</w:t>
-            </w:r>
-          </w:p>
-        </w:tc>
-        <w:tc>
-          <w:tcPr>
-            <w:tcW w:type="dxa" w:w="2436"/>
-            <w:shd w:fill="F3F7FB" w:val="clear"/>
-            <w:tcBorders>
-              <w:top w:val="single" w:sz="4" w:color="D0D7DE"/>
-              <w:left w:val="single" w:sz="4" w:color="D0D7DE"/>
-              <w:bottom w:val="single" w:sz="4" w:color="D0D7DE"/>
-              <w:right w:val="single" w:sz="4" w:color="D0D7DE"/>
-            </w:tcBorders>
-          </w:tcPr>
-          <w:p>
-            <w:r/>
-            <w:r>
-              <w:rPr>
-                <w:rFonts w:ascii="Calibri" w:hAnsi="Calibri" w:eastAsia="Calibri"/>
-                <w:b w:val="0"/>
-                <w:color w:val="1A1A1A"/>
-                <w:sz w:val="20"/>
-              </w:rPr>
-              <w:t>6 ноября</w:t>
-            </w:r>
-          </w:p>
-        </w:tc>
-      </w:tr>
-      <w:tr>
-        <w:tc>
-          <w:tcPr>
-            <w:tcW w:type="dxa" w:w="2436"/>
-            <w:tcBorders>
-              <w:top w:val="single" w:sz="4" w:color="D0D7DE"/>
-              <w:left w:val="single" w:sz="4" w:color="D0D7DE"/>
-              <w:bottom w:val="single" w:sz="4" w:color="D0D7DE"/>
-              <w:right w:val="single" w:sz="4" w:color="D0D7DE"/>
-            </w:tcBorders>
-          </w:tcPr>
-          <w:p>
-            <w:r/>
-            <w:r>
-              <w:rPr>
-                <w:rFonts w:ascii="Calibri" w:hAnsi="Calibri" w:eastAsia="Calibri"/>
-                <w:b w:val="0"/>
-                <w:color w:val="1A1A1A"/>
-                <w:sz w:val="20"/>
-              </w:rPr>
-              <w:t>Состав менторов</w:t>
-            </w:r>
-          </w:p>
-        </w:tc>
-        <w:tc>
-          <w:tcPr>
-            <w:tcW w:type="dxa" w:w="2436"/>
-            <w:tcBorders>
-              <w:top w:val="single" w:sz="4" w:color="D0D7DE"/>
-              <w:left w:val="single" w:sz="4" w:color="D0D7DE"/>
-              <w:bottom w:val="single" w:sz="4" w:color="D0D7DE"/>
-              <w:right w:val="single" w:sz="4" w:color="D0D7DE"/>
-            </w:tcBorders>
-          </w:tcPr>
-          <w:p>
-            <w:r/>
-            <w:r>
-              <w:rPr>
-                <w:rFonts w:ascii="Calibri" w:hAnsi="Calibri" w:eastAsia="Calibri"/>
-                <w:b w:val="0"/>
-                <w:color w:val="1A1A1A"/>
-                <w:sz w:val="20"/>
-              </w:rPr>
-              <w:t>Сопровождение MVP</w:t>
-            </w:r>
-          </w:p>
-        </w:tc>
-        <w:tc>
-          <w:tcPr>
-            <w:tcW w:type="dxa" w:w="2436"/>
-            <w:tcBorders>
-              <w:top w:val="single" w:sz="4" w:color="D0D7DE"/>
-              <w:left w:val="single" w:sz="4" w:color="D0D7DE"/>
-              <w:bottom w:val="single" w:sz="4" w:color="D0D7DE"/>
-              <w:right w:val="single" w:sz="4" w:color="D0D7DE"/>
-            </w:tcBorders>
-          </w:tcPr>
-          <w:p>
-            <w:r/>
-            <w:r>
-              <w:rPr>
-                <w:rFonts w:ascii="Calibri" w:hAnsi="Calibri" w:eastAsia="Calibri"/>
-                <w:b w:val="0"/>
-                <w:color w:val="1A1A1A"/>
-                <w:sz w:val="20"/>
-              </w:rPr>
-              <w:t>Никишева Елена</w:t>
-            </w:r>
-          </w:p>
-        </w:tc>
-        <w:tc>
-          <w:tcPr>
-            <w:tcW w:type="dxa" w:w="2436"/>
-            <w:tcBorders>
-              <w:top w:val="single" w:sz="4" w:color="D0D7DE"/>
-              <w:left w:val="single" w:sz="4" w:color="D0D7DE"/>
-              <w:bottom w:val="single" w:sz="4" w:color="D0D7DE"/>
-              <w:right w:val="single" w:sz="4" w:color="D0D7DE"/>
-            </w:tcBorders>
-          </w:tcPr>
-          <w:p>
-            <w:r/>
-            <w:r>
-              <w:rPr>
-                <w:rFonts w:ascii="Calibri" w:hAnsi="Calibri" w:eastAsia="Calibri"/>
-                <w:b w:val="0"/>
-                <w:color w:val="1A1A1A"/>
-                <w:sz w:val="20"/>
-              </w:rPr>
-              <w:t>7 ноября</w:t>
-            </w:r>
-          </w:p>
-        </w:tc>
-      </w:tr>
-      <w:tr>
-        <w:tc>
-          <w:tcPr>
-            <w:tcW w:type="dxa" w:w="2436"/>
-            <w:shd w:fill="F3F7FB" w:val="clear"/>
-            <w:tcBorders>
-              <w:top w:val="single" w:sz="4" w:color="D0D7DE"/>
-              <w:left w:val="single" w:sz="4" w:color="D0D7DE"/>
-              <w:bottom w:val="single" w:sz="4" w:color="D0D7DE"/>
-              <w:right w:val="single" w:sz="4" w:color="D0D7DE"/>
-            </w:tcBorders>
-          </w:tcPr>
-          <w:p>
-            <w:r/>
-            <w:r>
-              <w:rPr>
-                <w:rFonts w:ascii="Calibri" w:hAnsi="Calibri" w:eastAsia="Calibri"/>
-                <w:b w:val="0"/>
-                <w:color w:val="1A1A1A"/>
-                <w:sz w:val="20"/>
-              </w:rPr>
-              <w:t>Шаблон демо</w:t>
-            </w:r>
-          </w:p>
-        </w:tc>
-        <w:tc>
-          <w:tcPr>
-            <w:tcW w:type="dxa" w:w="2436"/>
-            <w:shd w:fill="F3F7FB" w:val="clear"/>
-            <w:tcBorders>
-              <w:top w:val="single" w:sz="4" w:color="D0D7DE"/>
-              <w:left w:val="single" w:sz="4" w:color="D0D7DE"/>
-              <w:bottom w:val="single" w:sz="4" w:color="D0D7DE"/>
-              <w:right w:val="single" w:sz="4" w:color="D0D7DE"/>
-            </w:tcBorders>
-          </w:tcPr>
-          <w:p>
-            <w:r/>
-            <w:r>
-              <w:rPr>
-                <w:rFonts w:ascii="Calibri" w:hAnsi="Calibri" w:eastAsia="Calibri"/>
-                <w:b w:val="0"/>
-                <w:color w:val="1A1A1A"/>
-                <w:sz w:val="20"/>
-              </w:rPr>
-              <w:t>Одинаковый показ 20 ноября</w:t>
-            </w:r>
-          </w:p>
-        </w:tc>
-        <w:tc>
-          <w:tcPr>
-            <w:tcW w:type="dxa" w:w="2436"/>
-            <w:shd w:fill="F3F7FB" w:val="clear"/>
-            <w:tcBorders>
-              <w:top w:val="single" w:sz="4" w:color="D0D7DE"/>
-              <w:left w:val="single" w:sz="4" w:color="D0D7DE"/>
-              <w:bottom w:val="single" w:sz="4" w:color="D0D7DE"/>
-              <w:right w:val="single" w:sz="4" w:color="D0D7DE"/>
-            </w:tcBorders>
-          </w:tcPr>
-          <w:p>
-            <w:r/>
-            <w:r>
-              <w:rPr>
-                <w:rFonts w:ascii="Calibri" w:hAnsi="Calibri" w:eastAsia="Calibri"/>
-                <w:b w:val="0"/>
-                <w:color w:val="1A1A1A"/>
-                <w:sz w:val="20"/>
-              </w:rPr>
-              <w:t>Никишева Елена</w:t>
-            </w:r>
-          </w:p>
-        </w:tc>
-        <w:tc>
-          <w:tcPr>
-            <w:tcW w:type="dxa" w:w="2436"/>
-            <w:shd w:fill="F3F7FB" w:val="clear"/>
-            <w:tcBorders>
-              <w:top w:val="single" w:sz="4" w:color="D0D7DE"/>
-              <w:left w:val="single" w:sz="4" w:color="D0D7DE"/>
-              <w:bottom w:val="single" w:sz="4" w:color="D0D7DE"/>
-              <w:right w:val="single" w:sz="4" w:color="D0D7DE"/>
-            </w:tcBorders>
-          </w:tcPr>
-          <w:p>
-            <w:r/>
-            <w:r>
-              <w:rPr>
-                <w:rFonts w:ascii="Calibri" w:hAnsi="Calibri" w:eastAsia="Calibri"/>
-                <w:b w:val="0"/>
-                <w:color w:val="1A1A1A"/>
-                <w:sz w:val="20"/>
-              </w:rPr>
-              <w:t>до 19 ноября</w:t>
-            </w:r>
-          </w:p>
-        </w:tc>
-      </w:tr>
-    </w:tbl>
-    <w:p>
-      <w:pPr>
-        <w:spacing w:after="80"/>
-      </w:pPr>
-    </w:p>
-    <w:p>
-      <w:pPr>
-        <w:spacing w:after="160" w:before="0" w:line="276" w:lineRule="auto"/>
-      </w:pPr>
-      <w:r>
-        <w:rPr>
-          <w:rFonts w:ascii="Calibri" w:hAnsi="Calibri" w:eastAsia="Calibri"/>
-          <w:b w:val="0"/>
-          <w:color w:val="1A1A1A"/>
-          <w:sz w:val="22"/>
-        </w:rPr>
-        <w:t>Сценарий обучения на 20 октября нужен ведущим, участникам его рассылать не обязательно.</w:t>
-      </w:r>
-    </w:p>
-    <w:p>
-      <w:pPr>
-        <w:spacing w:after="120" w:before="320" w:line="276" w:lineRule="auto"/>
-      </w:pPr>
-      <w:r>
-        <w:rPr>
-          <w:rFonts w:ascii="Calibri" w:hAnsi="Calibri" w:eastAsia="Calibri"/>
-          <w:b/>
-          <w:color w:val="1A1A1A"/>
-          <w:sz w:val="32"/>
-        </w:rPr>
-        <w:t>9. Открытые пункты</w:t>
-      </w:r>
-    </w:p>
-    <w:p>
-      <w:pPr>
-        <w:pStyle w:val="ListBullet"/>
-        <w:spacing w:after="60" w:line="276" w:lineRule="auto"/>
-      </w:pPr>
-      <w:r>
-        <w:rPr>
-          <w:rFonts w:ascii="Calibri" w:hAnsi="Calibri" w:eastAsia="Calibri"/>
-          <w:b w:val="0"/>
-          <w:color w:val="1A1A1A"/>
-          <w:sz w:val="22"/>
-        </w:rPr>
-        <w:t>порядок записи;</w:t>
-      </w:r>
-    </w:p>
-    <w:p>
-      <w:pPr>
-        <w:pStyle w:val="ListBullet"/>
-        <w:spacing w:after="60" w:line="276" w:lineRule="auto"/>
-      </w:pPr>
-      <w:r>
-        <w:rPr>
-          <w:rFonts w:ascii="Calibri" w:hAnsi="Calibri" w:eastAsia="Calibri"/>
-          <w:b w:val="0"/>
-          <w:color w:val="1A1A1A"/>
-          <w:sz w:val="22"/>
-        </w:rPr>
-        <w:t>точный порог прохождения тестового тура;</w:t>
-      </w:r>
-    </w:p>
-    <w:p>
-      <w:pPr>
-        <w:pStyle w:val="ListBullet"/>
-        <w:spacing w:after="60" w:line="276" w:lineRule="auto"/>
-      </w:pPr>
-      <w:r>
-        <w:rPr>
-          <w:rFonts w:ascii="Calibri" w:hAnsi="Calibri" w:eastAsia="Calibri"/>
-          <w:b w:val="0"/>
-          <w:color w:val="1A1A1A"/>
-          <w:sz w:val="22"/>
-        </w:rPr>
-        <w:t>сколько проектов идёт в MVP;</w:t>
-      </w:r>
-    </w:p>
-    <w:p>
-      <w:pPr>
-        <w:pStyle w:val="ListBullet"/>
-        <w:spacing w:after="60" w:line="276" w:lineRule="auto"/>
-      </w:pPr>
-      <w:r>
-        <w:rPr>
-          <w:rFonts w:ascii="Calibri" w:hAnsi="Calibri" w:eastAsia="Calibri"/>
-          <w:b w:val="0"/>
-          <w:color w:val="1A1A1A"/>
-          <w:sz w:val="22"/>
-        </w:rPr>
-        <w:t>имена жюри и состав менторов MVP;</w:t>
-      </w:r>
-    </w:p>
-    <w:p>
-      <w:pPr>
-        <w:pStyle w:val="ListBullet"/>
-        <w:spacing w:after="60" w:line="276" w:lineRule="auto"/>
-      </w:pPr>
-      <w:r>
-        <w:rPr>
-          <w:rFonts w:ascii="Calibri" w:hAnsi="Calibri" w:eastAsia="Calibri"/>
-          <w:b w:val="0"/>
-          <w:color w:val="1A1A1A"/>
-          <w:sz w:val="22"/>
-        </w:rPr>
-        <w:t>срок решения спонсоров после показа.</w:t>
-      </w:r>
-    </w:p>
-    <w:p>
-      <w:pPr>
-        <w:spacing w:after="160" w:before="0" w:line="276" w:lineRule="auto"/>
-      </w:pPr>
-      <w:r>
-        <w:rPr>
-          <w:rFonts w:ascii="Calibri" w:hAnsi="Calibri" w:eastAsia="Calibri"/>
-          <w:b w:val="0"/>
-          <w:color w:val="1A1A1A"/>
-          <w:sz w:val="22"/>
-        </w:rPr>
-        <w:t>Пока пункт открыт, его закрывает владелец. Новое правило, которое меняет календарь или контур сред, согласовывают спонсоры.</w:t>
-      </w:r>
-    </w:p>
-    <w:p>
-      <w:pPr>
         <w:spacing w:after="160" w:before="360" w:line="276" w:lineRule="auto"/>
       </w:pPr>
       <w:r>
@@ -3357,7 +2220,7 @@
           <w:color w:val="666666"/>
           <w:sz w:val="20"/>
         </w:rPr>
-        <w:t>Основание: слайды AI Challenge, календарь 19 октября — 20 ноября, оргкоманда и правило контура Bitrix Dev / Work IT Dev.</w:t>
+        <w:t>Основание: слайды AI Challenge, календарь 19 октября — 20 ноября и правило контура Bitrix Dev / Work IT Dev.</w:t>
       </w:r>
     </w:p>
     <w:sectPr>

</xml_diff>

<commit_message>
fix: keep applications open until 22 October at noon
Colleagues can still apply tomorrow until 12:00 MSK; the public form, cloud API and reglament now use the same deadline.

Co-authored-by: Cursor <cursoragent@cursor.com>
</commit_message>
<xml_diff>
--- a/Регламент AI Challenge.docx
+++ b/Регламент AI Challenge.docx
@@ -139,7 +139,7 @@
           <w:color w:val="1A1A1A"/>
           <w:sz w:val="22"/>
         </w:rPr>
-        <w:t>Участие только одиночное: один человек — один проект. Можно брать свой процесс, кросс-функциональный или процесс другой функции, если хорошо понимаете, как он устроен, и можете предложить конкретное изменение. Заявку на участие нужно подать до 21 октября.</w:t>
+        <w:t>Участие только одиночное: один человек — один проект. Можно брать свой процесс, кросс-функциональный или процесс другой функции, если хорошо понимаете, как он устроен, и можете предложить конкретное изменение. Заявку на участие нужно подать до 22 октября, 12:00 мск.</w:t>
       </w:r>
     </w:p>
     <w:p>
@@ -924,7 +924,9 @@
             </w:tcBorders>
           </w:tcPr>
           <w:p>
-            <w:r/>
+            <w:r>
+              <w:t>до 22 октября, 12:00</w:t>
+            </w:r>
             <w:r>
               <w:rPr>
                 <w:rFonts w:ascii="Calibri" w:hAnsi="Calibri" w:eastAsia="Calibri"/>
@@ -932,7 +934,6 @@
                 <w:color w:val="1A1A1A"/>
                 <w:sz w:val="20"/>
               </w:rPr>
-              <w:t>до 21 октября</w:t>
             </w:r>
           </w:p>
         </w:tc>
@@ -1350,7 +1351,7 @@
           <w:color w:val="1A1A1A"/>
           <w:sz w:val="22"/>
         </w:rPr>
-        <w:t>В тестовый тур выходят те, кто подал заявку на участие до 21 октября. Дальше к просмотру идей идут те, кто сдал тестовый тур: минипроцесс собран на тестовом стенде и его можно показать. Список тестового тура утверждает Никишева Елена.</w:t>
+        <w:t>В тестовый тур выходят те, кто подал заявку на участие до 22 октября, 12:00 мск. Дальше к просмотру идей идут те, кто сдал тестовый тур: минипроцесс собран на тестовом стенде и его можно показать. Список тестового тура утверждает Никишева Елена.</w:t>
       </w:r>
     </w:p>
     <w:p>
@@ -1406,7 +1407,7 @@
           <w:color w:val="1A1A1A"/>
           <w:sz w:val="26"/>
         </w:rPr>
-        <w:t>5.2. Заявка на участие · до 21 октября</w:t>
+        <w:t>5.2. Заявка на участие · до 22 октября, 12:00</w:t>
       </w:r>
     </w:p>
     <w:p>
@@ -1420,7 +1421,7 @@
           <w:color w:val="1A1A1A"/>
           <w:sz w:val="22"/>
         </w:rPr>
-        <w:t>Это короткая заявка «я участвую». Она не заменяет заявку на идею. Чтобы выйти в тестовый тур, нужно подать заявку на участие до 21 октября, 23:59 мск. В заявке: ФИО, должность, прошёл обучение или нет, и какой процесс рассматриваете — предварительно, его можно изменить. Восемь пунктов идеи — другая заявка, к просмотру 6 ноября.</w:t>
+        <w:t>Это короткая заявка «я участвую». Она не заменяет заявку на идею. Чтобы выйти в тестовый тур, нужно подать заявку на участие до 22 октября, 12:00 мск. В заявке: ФИО, должность, прошёл обучение или нет, и какой процесс рассматриваете — предварительно, его можно изменить. Восемь пунктов идеи — другая заявка, к просмотру 6 ноября.</w:t>
       </w:r>
     </w:p>
     <w:p>

</xml_diff>